<commit_message>
docs: diagrama de clases del backend
Diagrama de las cuatro capas de la aplicacion de backend con las clases
representativas de cada una, sus operaciones publicas y las dependencias
reales entre capas. Se incorpora al documento de entrega y al capitulo del
modelo de datos.
</commit_message>
<xml_diff>
--- a/docs/Tienda-Generica-Virtual-Documento-de-Entrega.docx
+++ b/docs/Tienda-Generica-Virtual-Documento-de-Entrega.docx
@@ -124,7 +124,7 @@
         <w:pStyle w:val="Ttulo1"/>
         <w:spacing w:before="360" w:after="180"/>
       </w:pPr>
-      <w:bookmarkStart w:id="0" w:name="_Toc238157972"/>
+      <w:bookmarkStart w:id="0" w:name="_Toc238187895"/>
       <w:r>
         <w:rPr>
           <w:b/>
@@ -320,7 +320,7 @@
         <w:pStyle w:val="Ttulo2"/>
         <w:spacing w:before="280" w:after="140"/>
       </w:pPr>
-      <w:bookmarkStart w:id="1" w:name="_Toc238157973"/>
+      <w:bookmarkStart w:id="1" w:name="_Toc238187896"/>
       <w:r>
         <w:rPr>
           <w:b/>
@@ -910,7 +910,7 @@
         <w:pStyle w:val="Ttulo1"/>
         <w:spacing w:before="360" w:after="180"/>
       </w:pPr>
-      <w:bookmarkStart w:id="2" w:name="_Toc238157974"/>
+      <w:bookmarkStart w:id="2" w:name="_Toc238187897"/>
       <w:r>
         <w:rPr>
           <w:b/>
@@ -925,7 +925,7 @@
     <w:sdt>
       <w:sdtPr>
         <w:alias w:val="Contenido"/>
-        <w:id w:val="441193878"/>
+        <w:id w:val="1267578942"/>
       </w:sdtPr>
       <w:sdtEndPr/>
       <w:sdtContent>
@@ -954,7 +954,7 @@
           <w:r>
             <w:fldChar w:fldCharType="separate"/>
           </w:r>
-          <w:hyperlink w:anchor="_Toc238157972" w:history="1">
+          <w:hyperlink w:anchor="_Toc238187895" w:history="1">
             <w:r>
               <w:rPr>
                 <w:rStyle w:val="Hipervnculo"/>
@@ -980,7 +980,7 @@
               <w:rPr>
                 <w:noProof/>
               </w:rPr>
-              <w:instrText xml:space="preserve"> PAGEREF _Toc238157972 \h </w:instrText>
+              <w:instrText xml:space="preserve"> PAGEREF _Toc238187895 \h </w:instrText>
             </w:r>
             <w:r>
               <w:rPr>
@@ -1023,7 +1023,7 @@
               <w14:ligatures w14:val="standardContextual"/>
             </w:rPr>
           </w:pPr>
-          <w:hyperlink w:anchor="_Toc238157973" w:history="1">
+          <w:hyperlink w:anchor="_Toc238187896" w:history="1">
             <w:r>
               <w:rPr>
                 <w:rStyle w:val="Hipervnculo"/>
@@ -1049,7 +1049,7 @@
               <w:rPr>
                 <w:noProof/>
               </w:rPr>
-              <w:instrText xml:space="preserve"> PAGEREF _Toc238157973 \h </w:instrText>
+              <w:instrText xml:space="preserve"> PAGEREF _Toc238187896 \h </w:instrText>
             </w:r>
             <w:r>
               <w:rPr>
@@ -1092,7 +1092,7 @@
               <w14:ligatures w14:val="standardContextual"/>
             </w:rPr>
           </w:pPr>
-          <w:hyperlink w:anchor="_Toc238157974" w:history="1">
+          <w:hyperlink w:anchor="_Toc238187897" w:history="1">
             <w:r>
               <w:rPr>
                 <w:rStyle w:val="Hipervnculo"/>
@@ -1118,7 +1118,7 @@
               <w:rPr>
                 <w:noProof/>
               </w:rPr>
-              <w:instrText xml:space="preserve"> PAGEREF _Toc238157974 \h </w:instrText>
+              <w:instrText xml:space="preserve"> PAGEREF _Toc238187897 \h </w:instrText>
             </w:r>
             <w:r>
               <w:rPr>
@@ -1161,7 +1161,7 @@
               <w14:ligatures w14:val="standardContextual"/>
             </w:rPr>
           </w:pPr>
-          <w:hyperlink w:anchor="_Toc238157975" w:history="1">
+          <w:hyperlink w:anchor="_Toc238187898" w:history="1">
             <w:r>
               <w:rPr>
                 <w:rStyle w:val="Hipervnculo"/>
@@ -1187,7 +1187,7 @@
               <w:rPr>
                 <w:noProof/>
               </w:rPr>
-              <w:instrText xml:space="preserve"> PAGEREF _Toc238157975 \h </w:instrText>
+              <w:instrText xml:space="preserve"> PAGEREF _Toc238187898 \h </w:instrText>
             </w:r>
             <w:r>
               <w:rPr>
@@ -1230,7 +1230,7 @@
               <w14:ligatures w14:val="standardContextual"/>
             </w:rPr>
           </w:pPr>
-          <w:hyperlink w:anchor="_Toc238157976" w:history="1">
+          <w:hyperlink w:anchor="_Toc238187899" w:history="1">
             <w:r>
               <w:rPr>
                 <w:rStyle w:val="Hipervnculo"/>
@@ -1256,7 +1256,7 @@
               <w:rPr>
                 <w:noProof/>
               </w:rPr>
-              <w:instrText xml:space="preserve"> PAGEREF _Toc238157976 \h </w:instrText>
+              <w:instrText xml:space="preserve"> PAGEREF _Toc238187899 \h </w:instrText>
             </w:r>
             <w:r>
               <w:rPr>
@@ -1299,7 +1299,7 @@
               <w14:ligatures w14:val="standardContextual"/>
             </w:rPr>
           </w:pPr>
-          <w:hyperlink w:anchor="_Toc238157977" w:history="1">
+          <w:hyperlink w:anchor="_Toc238187900" w:history="1">
             <w:r>
               <w:rPr>
                 <w:rStyle w:val="Hipervnculo"/>
@@ -1325,7 +1325,7 @@
               <w:rPr>
                 <w:noProof/>
               </w:rPr>
-              <w:instrText xml:space="preserve"> PAGEREF _Toc238157977 \h </w:instrText>
+              <w:instrText xml:space="preserve"> PAGEREF _Toc238187900 \h </w:instrText>
             </w:r>
             <w:r>
               <w:rPr>
@@ -1368,7 +1368,7 @@
               <w14:ligatures w14:val="standardContextual"/>
             </w:rPr>
           </w:pPr>
-          <w:hyperlink w:anchor="_Toc238157978" w:history="1">
+          <w:hyperlink w:anchor="_Toc238187901" w:history="1">
             <w:r>
               <w:rPr>
                 <w:rStyle w:val="Hipervnculo"/>
@@ -1394,7 +1394,7 @@
               <w:rPr>
                 <w:noProof/>
               </w:rPr>
-              <w:instrText xml:space="preserve"> PAGEREF _Toc238157978 \h </w:instrText>
+              <w:instrText xml:space="preserve"> PAGEREF _Toc238187901 \h </w:instrText>
             </w:r>
             <w:r>
               <w:rPr>
@@ -1437,7 +1437,7 @@
               <w14:ligatures w14:val="standardContextual"/>
             </w:rPr>
           </w:pPr>
-          <w:hyperlink w:anchor="_Toc238157979" w:history="1">
+          <w:hyperlink w:anchor="_Toc238187902" w:history="1">
             <w:r>
               <w:rPr>
                 <w:rStyle w:val="Hipervnculo"/>
@@ -1463,7 +1463,7 @@
               <w:rPr>
                 <w:noProof/>
               </w:rPr>
-              <w:instrText xml:space="preserve"> PAGEREF _Toc238157979 \h </w:instrText>
+              <w:instrText xml:space="preserve"> PAGEREF _Toc238187902 \h </w:instrText>
             </w:r>
             <w:r>
               <w:rPr>
@@ -1506,7 +1506,7 @@
               <w14:ligatures w14:val="standardContextual"/>
             </w:rPr>
           </w:pPr>
-          <w:hyperlink w:anchor="_Toc238157980" w:history="1">
+          <w:hyperlink w:anchor="_Toc238187903" w:history="1">
             <w:r>
               <w:rPr>
                 <w:rStyle w:val="Hipervnculo"/>
@@ -1532,7 +1532,7 @@
               <w:rPr>
                 <w:noProof/>
               </w:rPr>
-              <w:instrText xml:space="preserve"> PAGEREF _Toc238157980 \h </w:instrText>
+              <w:instrText xml:space="preserve"> PAGEREF _Toc238187903 \h </w:instrText>
             </w:r>
             <w:r>
               <w:rPr>
@@ -1575,7 +1575,7 @@
               <w14:ligatures w14:val="standardContextual"/>
             </w:rPr>
           </w:pPr>
-          <w:hyperlink w:anchor="_Toc238157981" w:history="1">
+          <w:hyperlink w:anchor="_Toc238187904" w:history="1">
             <w:r>
               <w:rPr>
                 <w:rStyle w:val="Hipervnculo"/>
@@ -1601,7 +1601,7 @@
               <w:rPr>
                 <w:noProof/>
               </w:rPr>
-              <w:instrText xml:space="preserve"> PAGEREF _Toc238157981 \h </w:instrText>
+              <w:instrText xml:space="preserve"> PAGEREF _Toc238187904 \h </w:instrText>
             </w:r>
             <w:r>
               <w:rPr>
@@ -1644,7 +1644,7 @@
               <w14:ligatures w14:val="standardContextual"/>
             </w:rPr>
           </w:pPr>
-          <w:hyperlink w:anchor="_Toc238157982" w:history="1">
+          <w:hyperlink w:anchor="_Toc238187905" w:history="1">
             <w:r>
               <w:rPr>
                 <w:rStyle w:val="Hipervnculo"/>
@@ -1670,7 +1670,7 @@
               <w:rPr>
                 <w:noProof/>
               </w:rPr>
-              <w:instrText xml:space="preserve"> PAGEREF _Toc238157982 \h </w:instrText>
+              <w:instrText xml:space="preserve"> PAGEREF _Toc238187905 \h </w:instrText>
             </w:r>
             <w:r>
               <w:rPr>
@@ -1713,7 +1713,7 @@
               <w14:ligatures w14:val="standardContextual"/>
             </w:rPr>
           </w:pPr>
-          <w:hyperlink w:anchor="_Toc238157983" w:history="1">
+          <w:hyperlink w:anchor="_Toc238187906" w:history="1">
             <w:r>
               <w:rPr>
                 <w:rStyle w:val="Hipervnculo"/>
@@ -1739,7 +1739,7 @@
               <w:rPr>
                 <w:noProof/>
               </w:rPr>
-              <w:instrText xml:space="preserve"> PAGEREF _Toc238157983 \h </w:instrText>
+              <w:instrText xml:space="preserve"> PAGEREF _Toc238187906 \h </w:instrText>
             </w:r>
             <w:r>
               <w:rPr>
@@ -1782,7 +1782,7 @@
               <w14:ligatures w14:val="standardContextual"/>
             </w:rPr>
           </w:pPr>
-          <w:hyperlink w:anchor="_Toc238157984" w:history="1">
+          <w:hyperlink w:anchor="_Toc238187907" w:history="1">
             <w:r>
               <w:rPr>
                 <w:rStyle w:val="Hipervnculo"/>
@@ -1808,7 +1808,7 @@
               <w:rPr>
                 <w:noProof/>
               </w:rPr>
-              <w:instrText xml:space="preserve"> PAGEREF _Toc238157984 \h </w:instrText>
+              <w:instrText xml:space="preserve"> PAGEREF _Toc238187907 \h </w:instrText>
             </w:r>
             <w:r>
               <w:rPr>
@@ -1851,7 +1851,7 @@
               <w14:ligatures w14:val="standardContextual"/>
             </w:rPr>
           </w:pPr>
-          <w:hyperlink w:anchor="_Toc238157985" w:history="1">
+          <w:hyperlink w:anchor="_Toc238187908" w:history="1">
             <w:r>
               <w:rPr>
                 <w:rStyle w:val="Hipervnculo"/>
@@ -1877,7 +1877,7 @@
               <w:rPr>
                 <w:noProof/>
               </w:rPr>
-              <w:instrText xml:space="preserve"> PAGEREF _Toc238157985 \h </w:instrText>
+              <w:instrText xml:space="preserve"> PAGEREF _Toc238187908 \h </w:instrText>
             </w:r>
             <w:r>
               <w:rPr>
@@ -1920,7 +1920,7 @@
               <w14:ligatures w14:val="standardContextual"/>
             </w:rPr>
           </w:pPr>
-          <w:hyperlink w:anchor="_Toc238157986" w:history="1">
+          <w:hyperlink w:anchor="_Toc238187909" w:history="1">
             <w:r>
               <w:rPr>
                 <w:rStyle w:val="Hipervnculo"/>
@@ -1946,7 +1946,7 @@
               <w:rPr>
                 <w:noProof/>
               </w:rPr>
-              <w:instrText xml:space="preserve"> PAGEREF _Toc238157986 \h </w:instrText>
+              <w:instrText xml:space="preserve"> PAGEREF _Toc238187909 \h </w:instrText>
             </w:r>
             <w:r>
               <w:rPr>
@@ -1989,7 +1989,7 @@
               <w14:ligatures w14:val="standardContextual"/>
             </w:rPr>
           </w:pPr>
-          <w:hyperlink w:anchor="_Toc238157987" w:history="1">
+          <w:hyperlink w:anchor="_Toc238187910" w:history="1">
             <w:r>
               <w:rPr>
                 <w:rStyle w:val="Hipervnculo"/>
@@ -2015,7 +2015,7 @@
               <w:rPr>
                 <w:noProof/>
               </w:rPr>
-              <w:instrText xml:space="preserve"> PAGEREF _Toc238157987 \h </w:instrText>
+              <w:instrText xml:space="preserve"> PAGEREF _Toc238187910 \h </w:instrText>
             </w:r>
             <w:r>
               <w:rPr>
@@ -2058,7 +2058,7 @@
               <w14:ligatures w14:val="standardContextual"/>
             </w:rPr>
           </w:pPr>
-          <w:hyperlink w:anchor="_Toc238157988" w:history="1">
+          <w:hyperlink w:anchor="_Toc238187911" w:history="1">
             <w:r>
               <w:rPr>
                 <w:rStyle w:val="Hipervnculo"/>
@@ -2084,7 +2084,7 @@
               <w:rPr>
                 <w:noProof/>
               </w:rPr>
-              <w:instrText xml:space="preserve"> PAGEREF _Toc238157988 \h </w:instrText>
+              <w:instrText xml:space="preserve"> PAGEREF _Toc238187911 \h </w:instrText>
             </w:r>
             <w:r>
               <w:rPr>
@@ -2127,7 +2127,7 @@
               <w14:ligatures w14:val="standardContextual"/>
             </w:rPr>
           </w:pPr>
-          <w:hyperlink w:anchor="_Toc238157989" w:history="1">
+          <w:hyperlink w:anchor="_Toc238187912" w:history="1">
             <w:r>
               <w:rPr>
                 <w:rStyle w:val="Hipervnculo"/>
@@ -2153,7 +2153,7 @@
               <w:rPr>
                 <w:noProof/>
               </w:rPr>
-              <w:instrText xml:space="preserve"> PAGEREF _Toc238157989 \h </w:instrText>
+              <w:instrText xml:space="preserve"> PAGEREF _Toc238187912 \h </w:instrText>
             </w:r>
             <w:r>
               <w:rPr>
@@ -2196,7 +2196,7 @@
               <w14:ligatures w14:val="standardContextual"/>
             </w:rPr>
           </w:pPr>
-          <w:hyperlink w:anchor="_Toc238157990" w:history="1">
+          <w:hyperlink w:anchor="_Toc238187913" w:history="1">
             <w:r>
               <w:rPr>
                 <w:rStyle w:val="Hipervnculo"/>
@@ -2222,7 +2222,7 @@
               <w:rPr>
                 <w:noProof/>
               </w:rPr>
-              <w:instrText xml:space="preserve"> PAGEREF _Toc238157990 \h </w:instrText>
+              <w:instrText xml:space="preserve"> PAGEREF _Toc238187913 \h </w:instrText>
             </w:r>
             <w:r>
               <w:rPr>
@@ -2265,7 +2265,7 @@
               <w14:ligatures w14:val="standardContextual"/>
             </w:rPr>
           </w:pPr>
-          <w:hyperlink w:anchor="_Toc238157991" w:history="1">
+          <w:hyperlink w:anchor="_Toc238187914" w:history="1">
             <w:r>
               <w:rPr>
                 <w:rStyle w:val="Hipervnculo"/>
@@ -2291,7 +2291,7 @@
               <w:rPr>
                 <w:noProof/>
               </w:rPr>
-              <w:instrText xml:space="preserve"> PAGEREF _Toc238157991 \h </w:instrText>
+              <w:instrText xml:space="preserve"> PAGEREF _Toc238187914 \h </w:instrText>
             </w:r>
             <w:r>
               <w:rPr>
@@ -2334,7 +2334,7 @@
               <w14:ligatures w14:val="standardContextual"/>
             </w:rPr>
           </w:pPr>
-          <w:hyperlink w:anchor="_Toc238157992" w:history="1">
+          <w:hyperlink w:anchor="_Toc238187915" w:history="1">
             <w:r>
               <w:rPr>
                 <w:rStyle w:val="Hipervnculo"/>
@@ -2360,7 +2360,7 @@
               <w:rPr>
                 <w:noProof/>
               </w:rPr>
-              <w:instrText xml:space="preserve"> PAGEREF _Toc238157992 \h </w:instrText>
+              <w:instrText xml:space="preserve"> PAGEREF _Toc238187915 \h </w:instrText>
             </w:r>
             <w:r>
               <w:rPr>
@@ -2403,7 +2403,7 @@
               <w14:ligatures w14:val="standardContextual"/>
             </w:rPr>
           </w:pPr>
-          <w:hyperlink w:anchor="_Toc238157993" w:history="1">
+          <w:hyperlink w:anchor="_Toc238187916" w:history="1">
             <w:r>
               <w:rPr>
                 <w:rStyle w:val="Hipervnculo"/>
@@ -2429,7 +2429,7 @@
               <w:rPr>
                 <w:noProof/>
               </w:rPr>
-              <w:instrText xml:space="preserve"> PAGEREF _Toc238157993 \h </w:instrText>
+              <w:instrText xml:space="preserve"> PAGEREF _Toc238187916 \h </w:instrText>
             </w:r>
             <w:r>
               <w:rPr>
@@ -2472,7 +2472,7 @@
               <w14:ligatures w14:val="standardContextual"/>
             </w:rPr>
           </w:pPr>
-          <w:hyperlink w:anchor="_Toc238157994" w:history="1">
+          <w:hyperlink w:anchor="_Toc238187917" w:history="1">
             <w:r>
               <w:rPr>
                 <w:rStyle w:val="Hipervnculo"/>
@@ -2498,7 +2498,7 @@
               <w:rPr>
                 <w:noProof/>
               </w:rPr>
-              <w:instrText xml:space="preserve"> PAGEREF _Toc238157994 \h </w:instrText>
+              <w:instrText xml:space="preserve"> PAGEREF _Toc238187917 \h </w:instrText>
             </w:r>
             <w:r>
               <w:rPr>
@@ -2541,7 +2541,7 @@
               <w14:ligatures w14:val="standardContextual"/>
             </w:rPr>
           </w:pPr>
-          <w:hyperlink w:anchor="_Toc238157995" w:history="1">
+          <w:hyperlink w:anchor="_Toc238187918" w:history="1">
             <w:r>
               <w:rPr>
                 <w:rStyle w:val="Hipervnculo"/>
@@ -2567,7 +2567,7 @@
               <w:rPr>
                 <w:noProof/>
               </w:rPr>
-              <w:instrText xml:space="preserve"> PAGEREF _Toc238157995 \h </w:instrText>
+              <w:instrText xml:space="preserve"> PAGEREF _Toc238187918 \h </w:instrText>
             </w:r>
             <w:r>
               <w:rPr>
@@ -2610,7 +2610,7 @@
               <w14:ligatures w14:val="standardContextual"/>
             </w:rPr>
           </w:pPr>
-          <w:hyperlink w:anchor="_Toc238157996" w:history="1">
+          <w:hyperlink w:anchor="_Toc238187919" w:history="1">
             <w:r>
               <w:rPr>
                 <w:rStyle w:val="Hipervnculo"/>
@@ -2636,7 +2636,7 @@
               <w:rPr>
                 <w:noProof/>
               </w:rPr>
-              <w:instrText xml:space="preserve"> PAGEREF _Toc238157996 \h </w:instrText>
+              <w:instrText xml:space="preserve"> PAGEREF _Toc238187919 \h </w:instrText>
             </w:r>
             <w:r>
               <w:rPr>
@@ -2679,7 +2679,7 @@
               <w14:ligatures w14:val="standardContextual"/>
             </w:rPr>
           </w:pPr>
-          <w:hyperlink w:anchor="_Toc238157997" w:history="1">
+          <w:hyperlink w:anchor="_Toc238187920" w:history="1">
             <w:r>
               <w:rPr>
                 <w:rStyle w:val="Hipervnculo"/>
@@ -2705,7 +2705,7 @@
               <w:rPr>
                 <w:noProof/>
               </w:rPr>
-              <w:instrText xml:space="preserve"> PAGEREF _Toc238157997 \h </w:instrText>
+              <w:instrText xml:space="preserve"> PAGEREF _Toc238187920 \h </w:instrText>
             </w:r>
             <w:r>
               <w:rPr>
@@ -2748,7 +2748,7 @@
               <w14:ligatures w14:val="standardContextual"/>
             </w:rPr>
           </w:pPr>
-          <w:hyperlink w:anchor="_Toc238157998" w:history="1">
+          <w:hyperlink w:anchor="_Toc238187921" w:history="1">
             <w:r>
               <w:rPr>
                 <w:rStyle w:val="Hipervnculo"/>
@@ -2774,7 +2774,7 @@
               <w:rPr>
                 <w:noProof/>
               </w:rPr>
-              <w:instrText xml:space="preserve"> PAGEREF _Toc238157998 \h </w:instrText>
+              <w:instrText xml:space="preserve"> PAGEREF _Toc238187921 \h </w:instrText>
             </w:r>
             <w:r>
               <w:rPr>
@@ -2817,7 +2817,7 @@
               <w14:ligatures w14:val="standardContextual"/>
             </w:rPr>
           </w:pPr>
-          <w:hyperlink w:anchor="_Toc238157999" w:history="1">
+          <w:hyperlink w:anchor="_Toc238187922" w:history="1">
             <w:r>
               <w:rPr>
                 <w:rStyle w:val="Hipervnculo"/>
@@ -2843,7 +2843,7 @@
               <w:rPr>
                 <w:noProof/>
               </w:rPr>
-              <w:instrText xml:space="preserve"> PAGEREF _Toc238157999 \h </w:instrText>
+              <w:instrText xml:space="preserve"> PAGEREF _Toc238187922 \h </w:instrText>
             </w:r>
             <w:r>
               <w:rPr>
@@ -2886,7 +2886,7 @@
               <w14:ligatures w14:val="standardContextual"/>
             </w:rPr>
           </w:pPr>
-          <w:hyperlink w:anchor="_Toc238158000" w:history="1">
+          <w:hyperlink w:anchor="_Toc238187923" w:history="1">
             <w:r>
               <w:rPr>
                 <w:rStyle w:val="Hipervnculo"/>
@@ -2912,7 +2912,7 @@
               <w:rPr>
                 <w:noProof/>
               </w:rPr>
-              <w:instrText xml:space="preserve"> PAGEREF _Toc238158000 \h </w:instrText>
+              <w:instrText xml:space="preserve"> PAGEREF _Toc238187923 \h </w:instrText>
             </w:r>
             <w:r>
               <w:rPr>
@@ -2955,7 +2955,7 @@
               <w14:ligatures w14:val="standardContextual"/>
             </w:rPr>
           </w:pPr>
-          <w:hyperlink w:anchor="_Toc238158001" w:history="1">
+          <w:hyperlink w:anchor="_Toc238187924" w:history="1">
             <w:r>
               <w:rPr>
                 <w:rStyle w:val="Hipervnculo"/>
@@ -2981,7 +2981,7 @@
               <w:rPr>
                 <w:noProof/>
               </w:rPr>
-              <w:instrText xml:space="preserve"> PAGEREF _Toc238158001 \h </w:instrText>
+              <w:instrText xml:space="preserve"> PAGEREF _Toc238187924 \h </w:instrText>
             </w:r>
             <w:r>
               <w:rPr>
@@ -3024,7 +3024,7 @@
               <w14:ligatures w14:val="standardContextual"/>
             </w:rPr>
           </w:pPr>
-          <w:hyperlink w:anchor="_Toc238158002" w:history="1">
+          <w:hyperlink w:anchor="_Toc238187925" w:history="1">
             <w:r>
               <w:rPr>
                 <w:rStyle w:val="Hipervnculo"/>
@@ -3050,7 +3050,7 @@
               <w:rPr>
                 <w:noProof/>
               </w:rPr>
-              <w:instrText xml:space="preserve"> PAGEREF _Toc238158002 \h </w:instrText>
+              <w:instrText xml:space="preserve"> PAGEREF _Toc238187925 \h </w:instrText>
             </w:r>
             <w:r>
               <w:rPr>
@@ -3093,7 +3093,7 @@
               <w14:ligatures w14:val="standardContextual"/>
             </w:rPr>
           </w:pPr>
-          <w:hyperlink w:anchor="_Toc238158003" w:history="1">
+          <w:hyperlink w:anchor="_Toc238187926" w:history="1">
             <w:r>
               <w:rPr>
                 <w:rStyle w:val="Hipervnculo"/>
@@ -3119,7 +3119,7 @@
               <w:rPr>
                 <w:noProof/>
               </w:rPr>
-              <w:instrText xml:space="preserve"> PAGEREF _Toc238158003 \h </w:instrText>
+              <w:instrText xml:space="preserve"> PAGEREF _Toc238187926 \h </w:instrText>
             </w:r>
             <w:r>
               <w:rPr>
@@ -3162,7 +3162,7 @@
               <w14:ligatures w14:val="standardContextual"/>
             </w:rPr>
           </w:pPr>
-          <w:hyperlink w:anchor="_Toc238158004" w:history="1">
+          <w:hyperlink w:anchor="_Toc238187927" w:history="1">
             <w:r>
               <w:rPr>
                 <w:rStyle w:val="Hipervnculo"/>
@@ -3188,7 +3188,7 @@
               <w:rPr>
                 <w:noProof/>
               </w:rPr>
-              <w:instrText xml:space="preserve"> PAGEREF _Toc238158004 \h </w:instrText>
+              <w:instrText xml:space="preserve"> PAGEREF _Toc238187927 \h </w:instrText>
             </w:r>
             <w:r>
               <w:rPr>
@@ -3231,7 +3231,7 @@
               <w14:ligatures w14:val="standardContextual"/>
             </w:rPr>
           </w:pPr>
-          <w:hyperlink w:anchor="_Toc238158005" w:history="1">
+          <w:hyperlink w:anchor="_Toc238187928" w:history="1">
             <w:r>
               <w:rPr>
                 <w:rStyle w:val="Hipervnculo"/>
@@ -3257,7 +3257,7 @@
               <w:rPr>
                 <w:noProof/>
               </w:rPr>
-              <w:instrText xml:space="preserve"> PAGEREF _Toc238158005 \h </w:instrText>
+              <w:instrText xml:space="preserve"> PAGEREF _Toc238187928 \h </w:instrText>
             </w:r>
             <w:r>
               <w:rPr>
@@ -3300,7 +3300,7 @@
               <w14:ligatures w14:val="standardContextual"/>
             </w:rPr>
           </w:pPr>
-          <w:hyperlink w:anchor="_Toc238158006" w:history="1">
+          <w:hyperlink w:anchor="_Toc238187929" w:history="1">
             <w:r>
               <w:rPr>
                 <w:rStyle w:val="Hipervnculo"/>
@@ -3326,7 +3326,7 @@
               <w:rPr>
                 <w:noProof/>
               </w:rPr>
-              <w:instrText xml:space="preserve"> PAGEREF _Toc238158006 \h </w:instrText>
+              <w:instrText xml:space="preserve"> PAGEREF _Toc238187929 \h </w:instrText>
             </w:r>
             <w:r>
               <w:rPr>
@@ -3369,7 +3369,7 @@
               <w14:ligatures w14:val="standardContextual"/>
             </w:rPr>
           </w:pPr>
-          <w:hyperlink w:anchor="_Toc238158007" w:history="1">
+          <w:hyperlink w:anchor="_Toc238187930" w:history="1">
             <w:r>
               <w:rPr>
                 <w:rStyle w:val="Hipervnculo"/>
@@ -3395,7 +3395,7 @@
               <w:rPr>
                 <w:noProof/>
               </w:rPr>
-              <w:instrText xml:space="preserve"> PAGEREF _Toc238158007 \h </w:instrText>
+              <w:instrText xml:space="preserve"> PAGEREF _Toc238187930 \h </w:instrText>
             </w:r>
             <w:r>
               <w:rPr>
@@ -3438,7 +3438,7 @@
               <w14:ligatures w14:val="standardContextual"/>
             </w:rPr>
           </w:pPr>
-          <w:hyperlink w:anchor="_Toc238158008" w:history="1">
+          <w:hyperlink w:anchor="_Toc238187931" w:history="1">
             <w:r>
               <w:rPr>
                 <w:rStyle w:val="Hipervnculo"/>
@@ -3464,7 +3464,7 @@
               <w:rPr>
                 <w:noProof/>
               </w:rPr>
-              <w:instrText xml:space="preserve"> PAGEREF _Toc238158008 \h </w:instrText>
+              <w:instrText xml:space="preserve"> PAGEREF _Toc238187931 \h </w:instrText>
             </w:r>
             <w:r>
               <w:rPr>
@@ -3507,7 +3507,7 @@
               <w14:ligatures w14:val="standardContextual"/>
             </w:rPr>
           </w:pPr>
-          <w:hyperlink w:anchor="_Toc238158009" w:history="1">
+          <w:hyperlink w:anchor="_Toc238187932" w:history="1">
             <w:r>
               <w:rPr>
                 <w:rStyle w:val="Hipervnculo"/>
@@ -3533,7 +3533,7 @@
               <w:rPr>
                 <w:noProof/>
               </w:rPr>
-              <w:instrText xml:space="preserve"> PAGEREF _Toc238158009 \h </w:instrText>
+              <w:instrText xml:space="preserve"> PAGEREF _Toc238187932 \h </w:instrText>
             </w:r>
             <w:r>
               <w:rPr>
@@ -3576,7 +3576,7 @@
               <w14:ligatures w14:val="standardContextual"/>
             </w:rPr>
           </w:pPr>
-          <w:hyperlink w:anchor="_Toc238158010" w:history="1">
+          <w:hyperlink w:anchor="_Toc238187933" w:history="1">
             <w:r>
               <w:rPr>
                 <w:rStyle w:val="Hipervnculo"/>
@@ -3602,7 +3602,7 @@
               <w:rPr>
                 <w:noProof/>
               </w:rPr>
-              <w:instrText xml:space="preserve"> PAGEREF _Toc238158010 \h </w:instrText>
+              <w:instrText xml:space="preserve"> PAGEREF _Toc238187933 \h </w:instrText>
             </w:r>
             <w:r>
               <w:rPr>
@@ -3645,7 +3645,7 @@
               <w14:ligatures w14:val="standardContextual"/>
             </w:rPr>
           </w:pPr>
-          <w:hyperlink w:anchor="_Toc238158011" w:history="1">
+          <w:hyperlink w:anchor="_Toc238187934" w:history="1">
             <w:r>
               <w:rPr>
                 <w:rStyle w:val="Hipervnculo"/>
@@ -3671,7 +3671,7 @@
               <w:rPr>
                 <w:noProof/>
               </w:rPr>
-              <w:instrText xml:space="preserve"> PAGEREF _Toc238158011 \h </w:instrText>
+              <w:instrText xml:space="preserve"> PAGEREF _Toc238187934 \h </w:instrText>
             </w:r>
             <w:r>
               <w:rPr>
@@ -3714,7 +3714,7 @@
               <w14:ligatures w14:val="standardContextual"/>
             </w:rPr>
           </w:pPr>
-          <w:hyperlink w:anchor="_Toc238158012" w:history="1">
+          <w:hyperlink w:anchor="_Toc238187935" w:history="1">
             <w:r>
               <w:rPr>
                 <w:rStyle w:val="Hipervnculo"/>
@@ -3740,7 +3740,7 @@
               <w:rPr>
                 <w:noProof/>
               </w:rPr>
-              <w:instrText xml:space="preserve"> PAGEREF _Toc238158012 \h </w:instrText>
+              <w:instrText xml:space="preserve"> PAGEREF _Toc238187935 \h </w:instrText>
             </w:r>
             <w:r>
               <w:rPr>
@@ -3783,7 +3783,7 @@
               <w14:ligatures w14:val="standardContextual"/>
             </w:rPr>
           </w:pPr>
-          <w:hyperlink w:anchor="_Toc238158013" w:history="1">
+          <w:hyperlink w:anchor="_Toc238187936" w:history="1">
             <w:r>
               <w:rPr>
                 <w:rStyle w:val="Hipervnculo"/>
@@ -3809,7 +3809,7 @@
               <w:rPr>
                 <w:noProof/>
               </w:rPr>
-              <w:instrText xml:space="preserve"> PAGEREF _Toc238158013 \h </w:instrText>
+              <w:instrText xml:space="preserve"> PAGEREF _Toc238187936 \h </w:instrText>
             </w:r>
             <w:r>
               <w:rPr>
@@ -3852,7 +3852,7 @@
               <w14:ligatures w14:val="standardContextual"/>
             </w:rPr>
           </w:pPr>
-          <w:hyperlink w:anchor="_Toc238158014" w:history="1">
+          <w:hyperlink w:anchor="_Toc238187937" w:history="1">
             <w:r>
               <w:rPr>
                 <w:rStyle w:val="Hipervnculo"/>
@@ -3878,7 +3878,7 @@
               <w:rPr>
                 <w:noProof/>
               </w:rPr>
-              <w:instrText xml:space="preserve"> PAGEREF _Toc238158014 \h </w:instrText>
+              <w:instrText xml:space="preserve"> PAGEREF _Toc238187937 \h </w:instrText>
             </w:r>
             <w:r>
               <w:rPr>
@@ -3921,7 +3921,7 @@
               <w14:ligatures w14:val="standardContextual"/>
             </w:rPr>
           </w:pPr>
-          <w:hyperlink w:anchor="_Toc238158015" w:history="1">
+          <w:hyperlink w:anchor="_Toc238187938" w:history="1">
             <w:r>
               <w:rPr>
                 <w:rStyle w:val="Hipervnculo"/>
@@ -3929,6 +3929,75 @@
                 <w:bCs/>
                 <w:noProof/>
               </w:rPr>
+              <w:t>Diagrama de clases</w:t>
+            </w:r>
+            <w:r>
+              <w:rPr>
+                <w:noProof/>
+              </w:rPr>
+              <w:tab/>
+            </w:r>
+            <w:r>
+              <w:rPr>
+                <w:noProof/>
+              </w:rPr>
+              <w:fldChar w:fldCharType="begin"/>
+            </w:r>
+            <w:r>
+              <w:rPr>
+                <w:noProof/>
+              </w:rPr>
+              <w:instrText xml:space="preserve"> PAGEREF _Toc238187938 \h </w:instrText>
+            </w:r>
+            <w:r>
+              <w:rPr>
+                <w:noProof/>
+              </w:rPr>
+            </w:r>
+            <w:r>
+              <w:rPr>
+                <w:noProof/>
+              </w:rPr>
+              <w:fldChar w:fldCharType="separate"/>
+            </w:r>
+            <w:r>
+              <w:rPr>
+                <w:noProof/>
+              </w:rPr>
+              <w:t>22</w:t>
+            </w:r>
+            <w:r>
+              <w:rPr>
+                <w:noProof/>
+              </w:rPr>
+              <w:fldChar w:fldCharType="end"/>
+            </w:r>
+          </w:hyperlink>
+        </w:p>
+        <w:p>
+          <w:pPr>
+            <w:pStyle w:val="TDC3"/>
+            <w:tabs>
+              <w:tab w:val="right" w:leader="dot" w:pos="9350"/>
+            </w:tabs>
+            <w:rPr>
+              <w:rFonts w:asciiTheme="minorHAnsi" w:eastAsiaTheme="minorEastAsia" w:hAnsiTheme="minorHAnsi" w:cstheme="minorBidi"/>
+              <w:noProof/>
+              <w:color w:val="auto"/>
+              <w:kern w:val="2"/>
+              <w:sz w:val="24"/>
+              <w:szCs w:val="24"/>
+              <w14:ligatures w14:val="standardContextual"/>
+            </w:rPr>
+          </w:pPr>
+          <w:hyperlink w:anchor="_Toc238187939" w:history="1">
+            <w:r>
+              <w:rPr>
+                <w:rStyle w:val="Hipervnculo"/>
+                <w:b/>
+                <w:bCs/>
+                <w:noProof/>
+              </w:rPr>
               <w:t>Estructura de las tablas</w:t>
             </w:r>
             <w:r>
@@ -3947,7 +4016,7 @@
               <w:rPr>
                 <w:noProof/>
               </w:rPr>
-              <w:instrText xml:space="preserve"> PAGEREF _Toc238158015 \h </w:instrText>
+              <w:instrText xml:space="preserve"> PAGEREF _Toc238187939 \h </w:instrText>
             </w:r>
             <w:r>
               <w:rPr>
@@ -3964,7 +4033,7 @@
               <w:rPr>
                 <w:noProof/>
               </w:rPr>
-              <w:t>22</w:t>
+              <w:t>24</w:t>
             </w:r>
             <w:r>
               <w:rPr>
@@ -3990,7 +4059,7 @@
               <w14:ligatures w14:val="standardContextual"/>
             </w:rPr>
           </w:pPr>
-          <w:hyperlink w:anchor="_Toc238158016" w:history="1">
+          <w:hyperlink w:anchor="_Toc238187940" w:history="1">
             <w:r>
               <w:rPr>
                 <w:rStyle w:val="Hipervnculo"/>
@@ -4016,7 +4085,7 @@
               <w:rPr>
                 <w:noProof/>
               </w:rPr>
-              <w:instrText xml:space="preserve"> PAGEREF _Toc238158016 \h </w:instrText>
+              <w:instrText xml:space="preserve"> PAGEREF _Toc238187940 \h </w:instrText>
             </w:r>
             <w:r>
               <w:rPr>
@@ -4033,7 +4102,7 @@
               <w:rPr>
                 <w:noProof/>
               </w:rPr>
-              <w:t>23</w:t>
+              <w:t>25</w:t>
             </w:r>
             <w:r>
               <w:rPr>
@@ -4059,7 +4128,7 @@
               <w14:ligatures w14:val="standardContextual"/>
             </w:rPr>
           </w:pPr>
-          <w:hyperlink w:anchor="_Toc238158017" w:history="1">
+          <w:hyperlink w:anchor="_Toc238187941" w:history="1">
             <w:r>
               <w:rPr>
                 <w:rStyle w:val="Hipervnculo"/>
@@ -4085,7 +4154,7 @@
               <w:rPr>
                 <w:noProof/>
               </w:rPr>
-              <w:instrText xml:space="preserve"> PAGEREF _Toc238158017 \h </w:instrText>
+              <w:instrText xml:space="preserve"> PAGEREF _Toc238187941 \h </w:instrText>
             </w:r>
             <w:r>
               <w:rPr>
@@ -4102,7 +4171,7 @@
               <w:rPr>
                 <w:noProof/>
               </w:rPr>
-              <w:t>23</w:t>
+              <w:t>25</w:t>
             </w:r>
             <w:r>
               <w:rPr>
@@ -4128,7 +4197,7 @@
               <w14:ligatures w14:val="standardContextual"/>
             </w:rPr>
           </w:pPr>
-          <w:hyperlink w:anchor="_Toc238158018" w:history="1">
+          <w:hyperlink w:anchor="_Toc238187942" w:history="1">
             <w:r>
               <w:rPr>
                 <w:rStyle w:val="Hipervnculo"/>
@@ -4154,7 +4223,7 @@
               <w:rPr>
                 <w:noProof/>
               </w:rPr>
-              <w:instrText xml:space="preserve"> PAGEREF _Toc238158018 \h </w:instrText>
+              <w:instrText xml:space="preserve"> PAGEREF _Toc238187942 \h </w:instrText>
             </w:r>
             <w:r>
               <w:rPr>
@@ -4171,7 +4240,7 @@
               <w:rPr>
                 <w:noProof/>
               </w:rPr>
-              <w:t>23</w:t>
+              <w:t>25</w:t>
             </w:r>
             <w:r>
               <w:rPr>
@@ -4197,7 +4266,7 @@
               <w14:ligatures w14:val="standardContextual"/>
             </w:rPr>
           </w:pPr>
-          <w:hyperlink w:anchor="_Toc238158019" w:history="1">
+          <w:hyperlink w:anchor="_Toc238187943" w:history="1">
             <w:r>
               <w:rPr>
                 <w:rStyle w:val="Hipervnculo"/>
@@ -4223,7 +4292,7 @@
               <w:rPr>
                 <w:noProof/>
               </w:rPr>
-              <w:instrText xml:space="preserve"> PAGEREF _Toc238158019 \h </w:instrText>
+              <w:instrText xml:space="preserve"> PAGEREF _Toc238187943 \h </w:instrText>
             </w:r>
             <w:r>
               <w:rPr>
@@ -4240,7 +4309,7 @@
               <w:rPr>
                 <w:noProof/>
               </w:rPr>
-              <w:t>23</w:t>
+              <w:t>25</w:t>
             </w:r>
             <w:r>
               <w:rPr>
@@ -4266,7 +4335,7 @@
               <w14:ligatures w14:val="standardContextual"/>
             </w:rPr>
           </w:pPr>
-          <w:hyperlink w:anchor="_Toc238158020" w:history="1">
+          <w:hyperlink w:anchor="_Toc238187944" w:history="1">
             <w:r>
               <w:rPr>
                 <w:rStyle w:val="Hipervnculo"/>
@@ -4292,7 +4361,7 @@
               <w:rPr>
                 <w:noProof/>
               </w:rPr>
-              <w:instrText xml:space="preserve"> PAGEREF _Toc238158020 \h </w:instrText>
+              <w:instrText xml:space="preserve"> PAGEREF _Toc238187944 \h </w:instrText>
             </w:r>
             <w:r>
               <w:rPr>
@@ -4309,7 +4378,7 @@
               <w:rPr>
                 <w:noProof/>
               </w:rPr>
-              <w:t>24</w:t>
+              <w:t>26</w:t>
             </w:r>
             <w:r>
               <w:rPr>
@@ -4335,7 +4404,7 @@
               <w14:ligatures w14:val="standardContextual"/>
             </w:rPr>
           </w:pPr>
-          <w:hyperlink w:anchor="_Toc238158021" w:history="1">
+          <w:hyperlink w:anchor="_Toc238187945" w:history="1">
             <w:r>
               <w:rPr>
                 <w:rStyle w:val="Hipervnculo"/>
@@ -4361,7 +4430,7 @@
               <w:rPr>
                 <w:noProof/>
               </w:rPr>
-              <w:instrText xml:space="preserve"> PAGEREF _Toc238158021 \h </w:instrText>
+              <w:instrText xml:space="preserve"> PAGEREF _Toc238187945 \h </w:instrText>
             </w:r>
             <w:r>
               <w:rPr>
@@ -4378,7 +4447,7 @@
               <w:rPr>
                 <w:noProof/>
               </w:rPr>
-              <w:t>25</w:t>
+              <w:t>27</w:t>
             </w:r>
             <w:r>
               <w:rPr>
@@ -4404,7 +4473,7 @@
               <w14:ligatures w14:val="standardContextual"/>
             </w:rPr>
           </w:pPr>
-          <w:hyperlink w:anchor="_Toc238158022" w:history="1">
+          <w:hyperlink w:anchor="_Toc238187946" w:history="1">
             <w:r>
               <w:rPr>
                 <w:rStyle w:val="Hipervnculo"/>
@@ -4430,7 +4499,7 @@
               <w:rPr>
                 <w:noProof/>
               </w:rPr>
-              <w:instrText xml:space="preserve"> PAGEREF _Toc238158022 \h </w:instrText>
+              <w:instrText xml:space="preserve"> PAGEREF _Toc238187946 \h </w:instrText>
             </w:r>
             <w:r>
               <w:rPr>
@@ -4447,7 +4516,7 @@
               <w:rPr>
                 <w:noProof/>
               </w:rPr>
-              <w:t>25</w:t>
+              <w:t>27</w:t>
             </w:r>
             <w:r>
               <w:rPr>
@@ -4473,7 +4542,7 @@
               <w14:ligatures w14:val="standardContextual"/>
             </w:rPr>
           </w:pPr>
-          <w:hyperlink w:anchor="_Toc238158023" w:history="1">
+          <w:hyperlink w:anchor="_Toc238187947" w:history="1">
             <w:r>
               <w:rPr>
                 <w:rStyle w:val="Hipervnculo"/>
@@ -4499,7 +4568,7 @@
               <w:rPr>
                 <w:noProof/>
               </w:rPr>
-              <w:instrText xml:space="preserve"> PAGEREF _Toc238158023 \h </w:instrText>
+              <w:instrText xml:space="preserve"> PAGEREF _Toc238187947 \h </w:instrText>
             </w:r>
             <w:r>
               <w:rPr>
@@ -4516,7 +4585,7 @@
               <w:rPr>
                 <w:noProof/>
               </w:rPr>
-              <w:t>25</w:t>
+              <w:t>27</w:t>
             </w:r>
             <w:r>
               <w:rPr>
@@ -4542,7 +4611,7 @@
               <w14:ligatures w14:val="standardContextual"/>
             </w:rPr>
           </w:pPr>
-          <w:hyperlink w:anchor="_Toc238158024" w:history="1">
+          <w:hyperlink w:anchor="_Toc238187948" w:history="1">
             <w:r>
               <w:rPr>
                 <w:rStyle w:val="Hipervnculo"/>
@@ -4568,7 +4637,7 @@
               <w:rPr>
                 <w:noProof/>
               </w:rPr>
-              <w:instrText xml:space="preserve"> PAGEREF _Toc238158024 \h </w:instrText>
+              <w:instrText xml:space="preserve"> PAGEREF _Toc238187948 \h </w:instrText>
             </w:r>
             <w:r>
               <w:rPr>
@@ -4585,7 +4654,7 @@
               <w:rPr>
                 <w:noProof/>
               </w:rPr>
-              <w:t>25</w:t>
+              <w:t>27</w:t>
             </w:r>
             <w:r>
               <w:rPr>
@@ -4611,7 +4680,7 @@
               <w14:ligatures w14:val="standardContextual"/>
             </w:rPr>
           </w:pPr>
-          <w:hyperlink w:anchor="_Toc238158025" w:history="1">
+          <w:hyperlink w:anchor="_Toc238187949" w:history="1">
             <w:r>
               <w:rPr>
                 <w:rStyle w:val="Hipervnculo"/>
@@ -4637,7 +4706,7 @@
               <w:rPr>
                 <w:noProof/>
               </w:rPr>
-              <w:instrText xml:space="preserve"> PAGEREF _Toc238158025 \h </w:instrText>
+              <w:instrText xml:space="preserve"> PAGEREF _Toc238187949 \h </w:instrText>
             </w:r>
             <w:r>
               <w:rPr>
@@ -4654,7 +4723,7 @@
               <w:rPr>
                 <w:noProof/>
               </w:rPr>
-              <w:t>26</w:t>
+              <w:t>28</w:t>
             </w:r>
             <w:r>
               <w:rPr>
@@ -4680,7 +4749,7 @@
               <w14:ligatures w14:val="standardContextual"/>
             </w:rPr>
           </w:pPr>
-          <w:hyperlink w:anchor="_Toc238158026" w:history="1">
+          <w:hyperlink w:anchor="_Toc238187950" w:history="1">
             <w:r>
               <w:rPr>
                 <w:rStyle w:val="Hipervnculo"/>
@@ -4706,7 +4775,7 @@
               <w:rPr>
                 <w:noProof/>
               </w:rPr>
-              <w:instrText xml:space="preserve"> PAGEREF _Toc238158026 \h </w:instrText>
+              <w:instrText xml:space="preserve"> PAGEREF _Toc238187950 \h </w:instrText>
             </w:r>
             <w:r>
               <w:rPr>
@@ -4723,7 +4792,7 @@
               <w:rPr>
                 <w:noProof/>
               </w:rPr>
-              <w:t>26</w:t>
+              <w:t>28</w:t>
             </w:r>
             <w:r>
               <w:rPr>
@@ -4749,7 +4818,7 @@
               <w14:ligatures w14:val="standardContextual"/>
             </w:rPr>
           </w:pPr>
-          <w:hyperlink w:anchor="_Toc238158027" w:history="1">
+          <w:hyperlink w:anchor="_Toc238187951" w:history="1">
             <w:r>
               <w:rPr>
                 <w:rStyle w:val="Hipervnculo"/>
@@ -4775,7 +4844,7 @@
               <w:rPr>
                 <w:noProof/>
               </w:rPr>
-              <w:instrText xml:space="preserve"> PAGEREF _Toc238158027 \h </w:instrText>
+              <w:instrText xml:space="preserve"> PAGEREF _Toc238187951 \h </w:instrText>
             </w:r>
             <w:r>
               <w:rPr>
@@ -4792,7 +4861,7 @@
               <w:rPr>
                 <w:noProof/>
               </w:rPr>
-              <w:t>27</w:t>
+              <w:t>29</w:t>
             </w:r>
             <w:r>
               <w:rPr>
@@ -4818,7 +4887,7 @@
               <w14:ligatures w14:val="standardContextual"/>
             </w:rPr>
           </w:pPr>
-          <w:hyperlink w:anchor="_Toc238158028" w:history="1">
+          <w:hyperlink w:anchor="_Toc238187952" w:history="1">
             <w:r>
               <w:rPr>
                 <w:rStyle w:val="Hipervnculo"/>
@@ -4844,7 +4913,7 @@
               <w:rPr>
                 <w:noProof/>
               </w:rPr>
-              <w:instrText xml:space="preserve"> PAGEREF _Toc238158028 \h </w:instrText>
+              <w:instrText xml:space="preserve"> PAGEREF _Toc238187952 \h </w:instrText>
             </w:r>
             <w:r>
               <w:rPr>
@@ -4861,7 +4930,7 @@
               <w:rPr>
                 <w:noProof/>
               </w:rPr>
-              <w:t>27</w:t>
+              <w:t>29</w:t>
             </w:r>
             <w:r>
               <w:rPr>
@@ -4887,7 +4956,7 @@
               <w14:ligatures w14:val="standardContextual"/>
             </w:rPr>
           </w:pPr>
-          <w:hyperlink w:anchor="_Toc238158029" w:history="1">
+          <w:hyperlink w:anchor="_Toc238187953" w:history="1">
             <w:r>
               <w:rPr>
                 <w:rStyle w:val="Hipervnculo"/>
@@ -4913,7 +4982,7 @@
               <w:rPr>
                 <w:noProof/>
               </w:rPr>
-              <w:instrText xml:space="preserve"> PAGEREF _Toc238158029 \h </w:instrText>
+              <w:instrText xml:space="preserve"> PAGEREF _Toc238187953 \h </w:instrText>
             </w:r>
             <w:r>
               <w:rPr>
@@ -4930,7 +4999,7 @@
               <w:rPr>
                 <w:noProof/>
               </w:rPr>
-              <w:t>27</w:t>
+              <w:t>29</w:t>
             </w:r>
             <w:r>
               <w:rPr>
@@ -4956,7 +5025,7 @@
               <w14:ligatures w14:val="standardContextual"/>
             </w:rPr>
           </w:pPr>
-          <w:hyperlink w:anchor="_Toc238158030" w:history="1">
+          <w:hyperlink w:anchor="_Toc238187954" w:history="1">
             <w:r>
               <w:rPr>
                 <w:rStyle w:val="Hipervnculo"/>
@@ -4982,7 +5051,7 @@
               <w:rPr>
                 <w:noProof/>
               </w:rPr>
-              <w:instrText xml:space="preserve"> PAGEREF _Toc238158030 \h </w:instrText>
+              <w:instrText xml:space="preserve"> PAGEREF _Toc238187954 \h </w:instrText>
             </w:r>
             <w:r>
               <w:rPr>
@@ -4999,7 +5068,7 @@
               <w:rPr>
                 <w:noProof/>
               </w:rPr>
-              <w:t>27</w:t>
+              <w:t>29</w:t>
             </w:r>
             <w:r>
               <w:rPr>
@@ -5025,7 +5094,7 @@
               <w14:ligatures w14:val="standardContextual"/>
             </w:rPr>
           </w:pPr>
-          <w:hyperlink w:anchor="_Toc238158031" w:history="1">
+          <w:hyperlink w:anchor="_Toc238187955" w:history="1">
             <w:r>
               <w:rPr>
                 <w:rStyle w:val="Hipervnculo"/>
@@ -5051,7 +5120,7 @@
               <w:rPr>
                 <w:noProof/>
               </w:rPr>
-              <w:instrText xml:space="preserve"> PAGEREF _Toc238158031 \h </w:instrText>
+              <w:instrText xml:space="preserve"> PAGEREF _Toc238187955 \h </w:instrText>
             </w:r>
             <w:r>
               <w:rPr>
@@ -5068,7 +5137,7 @@
               <w:rPr>
                 <w:noProof/>
               </w:rPr>
-              <w:t>29</w:t>
+              <w:t>31</w:t>
             </w:r>
             <w:r>
               <w:rPr>
@@ -5094,7 +5163,7 @@
               <w14:ligatures w14:val="standardContextual"/>
             </w:rPr>
           </w:pPr>
-          <w:hyperlink w:anchor="_Toc238158032" w:history="1">
+          <w:hyperlink w:anchor="_Toc238187956" w:history="1">
             <w:r>
               <w:rPr>
                 <w:rStyle w:val="Hipervnculo"/>
@@ -5120,7 +5189,7 @@
               <w:rPr>
                 <w:noProof/>
               </w:rPr>
-              <w:instrText xml:space="preserve"> PAGEREF _Toc238158032 \h </w:instrText>
+              <w:instrText xml:space="preserve"> PAGEREF _Toc238187956 \h </w:instrText>
             </w:r>
             <w:r>
               <w:rPr>
@@ -5137,7 +5206,7 @@
               <w:rPr>
                 <w:noProof/>
               </w:rPr>
-              <w:t>29</w:t>
+              <w:t>31</w:t>
             </w:r>
             <w:r>
               <w:rPr>
@@ -5163,7 +5232,7 @@
               <w14:ligatures w14:val="standardContextual"/>
             </w:rPr>
           </w:pPr>
-          <w:hyperlink w:anchor="_Toc238158033" w:history="1">
+          <w:hyperlink w:anchor="_Toc238187957" w:history="1">
             <w:r>
               <w:rPr>
                 <w:rStyle w:val="Hipervnculo"/>
@@ -5189,7 +5258,7 @@
               <w:rPr>
                 <w:noProof/>
               </w:rPr>
-              <w:instrText xml:space="preserve"> PAGEREF _Toc238158033 \h </w:instrText>
+              <w:instrText xml:space="preserve"> PAGEREF _Toc238187957 \h </w:instrText>
             </w:r>
             <w:r>
               <w:rPr>
@@ -5206,7 +5275,7 @@
               <w:rPr>
                 <w:noProof/>
               </w:rPr>
-              <w:t>29</w:t>
+              <w:t>31</w:t>
             </w:r>
             <w:r>
               <w:rPr>
@@ -5232,7 +5301,7 @@
               <w14:ligatures w14:val="standardContextual"/>
             </w:rPr>
           </w:pPr>
-          <w:hyperlink w:anchor="_Toc238158034" w:history="1">
+          <w:hyperlink w:anchor="_Toc238187958" w:history="1">
             <w:r>
               <w:rPr>
                 <w:rStyle w:val="Hipervnculo"/>
@@ -5258,7 +5327,7 @@
               <w:rPr>
                 <w:noProof/>
               </w:rPr>
-              <w:instrText xml:space="preserve"> PAGEREF _Toc238158034 \h </w:instrText>
+              <w:instrText xml:space="preserve"> PAGEREF _Toc238187958 \h </w:instrText>
             </w:r>
             <w:r>
               <w:rPr>
@@ -5275,7 +5344,7 @@
               <w:rPr>
                 <w:noProof/>
               </w:rPr>
-              <w:t>30</w:t>
+              <w:t>32</w:t>
             </w:r>
             <w:r>
               <w:rPr>
@@ -5317,7 +5386,7 @@
         <w:pStyle w:val="Ttulo1"/>
         <w:spacing w:before="360" w:after="180"/>
       </w:pPr>
-      <w:bookmarkStart w:id="3" w:name="_Toc238157975"/>
+      <w:bookmarkStart w:id="3" w:name="_Toc238187898"/>
       <w:r>
         <w:rPr>
           <w:b/>
@@ -5342,7 +5411,7 @@
         <w:pStyle w:val="Ttulo2"/>
         <w:spacing w:before="280" w:after="140"/>
       </w:pPr>
-      <w:bookmarkStart w:id="4" w:name="_Toc238157976"/>
+      <w:bookmarkStart w:id="4" w:name="_Toc238187899"/>
       <w:r>
         <w:rPr>
           <w:b/>
@@ -5374,7 +5443,7 @@
         <w:pStyle w:val="Ttulo2"/>
         <w:spacing w:before="280" w:after="140"/>
       </w:pPr>
-      <w:bookmarkStart w:id="5" w:name="_Toc238157977"/>
+      <w:bookmarkStart w:id="5" w:name="_Toc238187900"/>
       <w:r>
         <w:rPr>
           <w:b/>
@@ -5403,7 +5472,7 @@
           <w:noProof/>
         </w:rPr>
         <w:drawing>
-          <wp:inline distT="0" distB="0" distL="0" distR="0" wp14:anchorId="327B193E" wp14:editId="37843937">
+          <wp:inline distT="0" distB="0" distL="0" distR="0" wp14:anchorId="31F35E11" wp14:editId="606C7829">
             <wp:extent cx="5715000" cy="3695700"/>
             <wp:effectExtent l="0" t="0" r="0" b="0"/>
             <wp:docPr id="1" name="Imagen 1"/>
@@ -5477,7 +5546,7 @@
         <w:pStyle w:val="Ttulo1"/>
         <w:spacing w:before="360" w:after="180"/>
       </w:pPr>
-      <w:bookmarkStart w:id="6" w:name="_Toc238157978"/>
+      <w:bookmarkStart w:id="6" w:name="_Toc238187901"/>
       <w:r>
         <w:rPr>
           <w:b/>
@@ -5502,7 +5571,7 @@
         <w:pStyle w:val="Ttulo2"/>
         <w:spacing w:before="280" w:after="140"/>
       </w:pPr>
-      <w:bookmarkStart w:id="7" w:name="_Toc238157979"/>
+      <w:bookmarkStart w:id="7" w:name="_Toc238187902"/>
       <w:r>
         <w:rPr>
           <w:b/>
@@ -5534,7 +5603,7 @@
         <w:pStyle w:val="Ttulo2"/>
         <w:spacing w:before="280" w:after="140"/>
       </w:pPr>
-      <w:bookmarkStart w:id="8" w:name="_Toc238157980"/>
+      <w:bookmarkStart w:id="8" w:name="_Toc238187903"/>
       <w:r>
         <w:rPr>
           <w:b/>
@@ -5558,7 +5627,7 @@
         <w:pStyle w:val="Ttulo2"/>
         <w:spacing w:before="280" w:after="140"/>
       </w:pPr>
-      <w:bookmarkStart w:id="9" w:name="_Toc238157981"/>
+      <w:bookmarkStart w:id="9" w:name="_Toc238187904"/>
       <w:r>
         <w:rPr>
           <w:b/>
@@ -5582,7 +5651,7 @@
         <w:pStyle w:val="Ttulo2"/>
         <w:spacing w:before="280" w:after="140"/>
       </w:pPr>
-      <w:bookmarkStart w:id="10" w:name="_Toc238157982"/>
+      <w:bookmarkStart w:id="10" w:name="_Toc238187905"/>
       <w:r>
         <w:rPr>
           <w:b/>
@@ -5606,7 +5675,7 @@
         <w:pStyle w:val="Ttulo2"/>
         <w:spacing w:before="280" w:after="140"/>
       </w:pPr>
-      <w:bookmarkStart w:id="11" w:name="_Toc238157983"/>
+      <w:bookmarkStart w:id="11" w:name="_Toc238187906"/>
       <w:r>
         <w:rPr>
           <w:b/>
@@ -6468,7 +6537,7 @@
         <w:pStyle w:val="Ttulo2"/>
         <w:spacing w:before="280" w:after="140"/>
       </w:pPr>
-      <w:bookmarkStart w:id="12" w:name="_Toc238157984"/>
+      <w:bookmarkStart w:id="12" w:name="_Toc238187907"/>
       <w:r>
         <w:rPr>
           <w:b/>
@@ -6834,7 +6903,7 @@
         <w:pStyle w:val="Ttulo2"/>
         <w:spacing w:before="280" w:after="140"/>
       </w:pPr>
-      <w:bookmarkStart w:id="13" w:name="_Toc238157985"/>
+      <w:bookmarkStart w:id="13" w:name="_Toc238187908"/>
       <w:r>
         <w:rPr>
           <w:b/>
@@ -6863,7 +6932,7 @@
         <w:pStyle w:val="Ttulo1"/>
         <w:spacing w:before="360" w:after="180"/>
       </w:pPr>
-      <w:bookmarkStart w:id="14" w:name="_Toc238157986"/>
+      <w:bookmarkStart w:id="14" w:name="_Toc238187909"/>
       <w:r>
         <w:rPr>
           <w:b/>
@@ -7347,7 +7416,7 @@
         <w:pStyle w:val="Ttulo2"/>
         <w:spacing w:before="280" w:after="140"/>
       </w:pPr>
-      <w:bookmarkStart w:id="15" w:name="_Toc238157987"/>
+      <w:bookmarkStart w:id="15" w:name="_Toc238187910"/>
       <w:r>
         <w:rPr>
           <w:b/>
@@ -7649,7 +7718,7 @@
         <w:pStyle w:val="Ttulo2"/>
         <w:spacing w:before="280" w:after="140"/>
       </w:pPr>
-      <w:bookmarkStart w:id="16" w:name="_Toc238157988"/>
+      <w:bookmarkStart w:id="16" w:name="_Toc238187911"/>
       <w:r>
         <w:rPr>
           <w:b/>
@@ -8125,7 +8194,7 @@
         <w:pStyle w:val="Ttulo1"/>
         <w:spacing w:before="360" w:after="180"/>
       </w:pPr>
-      <w:bookmarkStart w:id="17" w:name="_Toc238157989"/>
+      <w:bookmarkStart w:id="17" w:name="_Toc238187912"/>
       <w:r>
         <w:rPr>
           <w:b/>
@@ -8150,7 +8219,7 @@
         <w:pStyle w:val="Ttulo2"/>
         <w:spacing w:before="280" w:after="140"/>
       </w:pPr>
-      <w:bookmarkStart w:id="18" w:name="_Toc238157990"/>
+      <w:bookmarkStart w:id="18" w:name="_Toc238187913"/>
       <w:r>
         <w:rPr>
           <w:b/>
@@ -8166,7 +8235,7 @@
         <w:pStyle w:val="Ttulo3"/>
         <w:spacing w:before="220" w:after="120"/>
       </w:pPr>
-      <w:bookmarkStart w:id="19" w:name="_Toc238157991"/>
+      <w:bookmarkStart w:id="19" w:name="_Toc238187914"/>
       <w:r>
         <w:rPr>
           <w:b/>
@@ -8755,7 +8824,7 @@
         <w:pStyle w:val="Ttulo3"/>
         <w:spacing w:before="220" w:after="120"/>
       </w:pPr>
-      <w:bookmarkStart w:id="20" w:name="_Toc238157992"/>
+      <w:bookmarkStart w:id="20" w:name="_Toc238187915"/>
       <w:r>
         <w:rPr>
           <w:b/>
@@ -8778,10 +8847,10 @@
           <w:noProof/>
         </w:rPr>
         <w:drawing>
-          <wp:inline distT="0" distB="0" distL="0" distR="0" wp14:anchorId="6693B6B7" wp14:editId="4BD56C1D">
-            <wp:extent cx="4953000" cy="1628775"/>
+          <wp:inline distT="0" distB="0" distL="0" distR="0" wp14:anchorId="3C4AA066" wp14:editId="15F84B4A">
+            <wp:extent cx="4953000" cy="2371725"/>
             <wp:effectExtent l="0" t="0" r="0" b="0"/>
-            <wp:docPr id="2018876538" name="Imagen 2018876538"/>
+            <wp:docPr id="505712175" name="Imagen 505712175"/>
             <wp:cNvGraphicFramePr>
               <a:graphicFrameLocks xmlns:a="http://schemas.openxmlformats.org/drawingml/2006/main" noChangeAspect="1"/>
             </wp:cNvGraphicFramePr>
@@ -8804,7 +8873,7 @@
                   <pic:spPr bwMode="auto">
                     <a:xfrm>
                       <a:off x="0" y="0"/>
-                      <a:ext cx="4953000" cy="1628775"/>
+                      <a:ext cx="4953000" cy="2371725"/>
                     </a:xfrm>
                     <a:prstGeom prst="rect">
                       <a:avLst/>
@@ -8843,10 +8912,10 @@
           <w:noProof/>
         </w:rPr>
         <w:drawing>
-          <wp:inline distT="0" distB="0" distL="0" distR="0" wp14:anchorId="55A16203" wp14:editId="2B39DFE3">
+          <wp:inline distT="0" distB="0" distL="0" distR="0" wp14:anchorId="716D0E60" wp14:editId="7FCD776D">
             <wp:extent cx="4953000" cy="809625"/>
             <wp:effectExtent l="0" t="0" r="0" b="0"/>
-            <wp:docPr id="1065287871" name="Imagen 1065287871"/>
+            <wp:docPr id="765386565" name="Imagen 765386565"/>
             <wp:cNvGraphicFramePr>
               <a:graphicFrameLocks xmlns:a="http://schemas.openxmlformats.org/drawingml/2006/main" noChangeAspect="1"/>
             </wp:cNvGraphicFramePr>
@@ -8895,6 +8964,7 @@
           <w:sz w:val="18"/>
           <w:szCs w:val="18"/>
         </w:rPr>
+        <w:lastRenderedPageBreak/>
         <w:t>Figura 3. Menú general con los seis módulos del sistema.</w:t>
       </w:r>
     </w:p>
@@ -8907,12 +8977,11 @@
         <w:rPr>
           <w:noProof/>
         </w:rPr>
-        <w:lastRenderedPageBreak/>
         <w:drawing>
-          <wp:inline distT="0" distB="0" distL="0" distR="0" wp14:anchorId="664ED64A" wp14:editId="797FB204">
+          <wp:inline distT="0" distB="0" distL="0" distR="0" wp14:anchorId="086B88DC" wp14:editId="206E27EE">
             <wp:extent cx="4953000" cy="1609725"/>
             <wp:effectExtent l="0" t="0" r="0" b="0"/>
-            <wp:docPr id="1628853776" name="Imagen 1628853776"/>
+            <wp:docPr id="396782790" name="Imagen 396782790"/>
             <wp:cNvGraphicFramePr>
               <a:graphicFrameLocks xmlns:a="http://schemas.openxmlformats.org/drawingml/2006/main" noChangeAspect="1"/>
             </wp:cNvGraphicFramePr>
@@ -8969,7 +9038,7 @@
         <w:pStyle w:val="Ttulo3"/>
         <w:spacing w:before="220" w:after="120"/>
       </w:pPr>
-      <w:bookmarkStart w:id="21" w:name="_Toc238157993"/>
+      <w:bookmarkStart w:id="21" w:name="_Toc238187916"/>
       <w:r>
         <w:rPr>
           <w:b/>
@@ -10003,7 +10072,7 @@
         <w:pStyle w:val="Ttulo2"/>
         <w:spacing w:before="280" w:after="140"/>
       </w:pPr>
-      <w:bookmarkStart w:id="22" w:name="_Toc238157994"/>
+      <w:bookmarkStart w:id="22" w:name="_Toc238187917"/>
       <w:r>
         <w:rPr>
           <w:b/>
@@ -10020,7 +10089,7 @@
         <w:pStyle w:val="Ttulo3"/>
         <w:spacing w:before="220" w:after="120"/>
       </w:pPr>
-      <w:bookmarkStart w:id="23" w:name="_Toc238157995"/>
+      <w:bookmarkStart w:id="23" w:name="_Toc238187918"/>
       <w:r>
         <w:rPr>
           <w:b/>
@@ -10873,7 +10942,7 @@
         <w:pStyle w:val="Ttulo3"/>
         <w:spacing w:before="220" w:after="120"/>
       </w:pPr>
-      <w:bookmarkStart w:id="24" w:name="_Toc238157996"/>
+      <w:bookmarkStart w:id="24" w:name="_Toc238187919"/>
       <w:r>
         <w:rPr>
           <w:b/>
@@ -10896,10 +10965,10 @@
           <w:noProof/>
         </w:rPr>
         <w:drawing>
-          <wp:inline distT="0" distB="0" distL="0" distR="0" wp14:anchorId="32DD3B31" wp14:editId="6C348477">
+          <wp:inline distT="0" distB="0" distL="0" distR="0" wp14:anchorId="3CFE9E4B" wp14:editId="0F0B6C01">
             <wp:extent cx="4953000" cy="1609725"/>
             <wp:effectExtent l="0" t="0" r="0" b="0"/>
-            <wp:docPr id="562356726" name="Imagen 562356726"/>
+            <wp:docPr id="833738943" name="Imagen 833738943"/>
             <wp:cNvGraphicFramePr>
               <a:graphicFrameLocks xmlns:a="http://schemas.openxmlformats.org/drawingml/2006/main" noChangeAspect="1"/>
             </wp:cNvGraphicFramePr>
@@ -10961,10 +11030,10 @@
           <w:noProof/>
         </w:rPr>
         <w:drawing>
-          <wp:inline distT="0" distB="0" distL="0" distR="0" wp14:anchorId="35CAB5E1" wp14:editId="3CB03AE7">
+          <wp:inline distT="0" distB="0" distL="0" distR="0" wp14:anchorId="443B2427" wp14:editId="2BE6B214">
             <wp:extent cx="4953000" cy="1609725"/>
             <wp:effectExtent l="0" t="0" r="0" b="0"/>
-            <wp:docPr id="1994044671" name="Imagen 1994044671"/>
+            <wp:docPr id="1763346153" name="Imagen 1763346153"/>
             <wp:cNvGraphicFramePr>
               <a:graphicFrameLocks xmlns:a="http://schemas.openxmlformats.org/drawingml/2006/main" noChangeAspect="1"/>
             </wp:cNvGraphicFramePr>
@@ -11021,7 +11090,7 @@
         <w:pStyle w:val="Ttulo3"/>
         <w:spacing w:before="220" w:after="120"/>
       </w:pPr>
-      <w:bookmarkStart w:id="25" w:name="_Toc238157997"/>
+      <w:bookmarkStart w:id="25" w:name="_Toc238187920"/>
       <w:r>
         <w:rPr>
           <w:b/>
@@ -12584,7 +12653,7 @@
         <w:pStyle w:val="Ttulo2"/>
         <w:spacing w:before="280" w:after="140"/>
       </w:pPr>
-      <w:bookmarkStart w:id="26" w:name="_Toc238157998"/>
+      <w:bookmarkStart w:id="26" w:name="_Toc238187921"/>
       <w:r>
         <w:rPr>
           <w:b/>
@@ -12601,7 +12670,7 @@
         <w:pStyle w:val="Ttulo3"/>
         <w:spacing w:before="220" w:after="120"/>
       </w:pPr>
-      <w:bookmarkStart w:id="27" w:name="_Toc238157999"/>
+      <w:bookmarkStart w:id="27" w:name="_Toc238187922"/>
       <w:r>
         <w:rPr>
           <w:b/>
@@ -12838,7 +12907,7 @@
         <w:pStyle w:val="Ttulo3"/>
         <w:spacing w:before="220" w:after="120"/>
       </w:pPr>
-      <w:bookmarkStart w:id="28" w:name="_Toc238158000"/>
+      <w:bookmarkStart w:id="28" w:name="_Toc238187923"/>
       <w:r>
         <w:rPr>
           <w:b/>
@@ -12861,10 +12930,10 @@
           <w:noProof/>
         </w:rPr>
         <w:drawing>
-          <wp:inline distT="0" distB="0" distL="0" distR="0" wp14:anchorId="4FD0724E" wp14:editId="0ABDF1A2">
+          <wp:inline distT="0" distB="0" distL="0" distR="0" wp14:anchorId="4C4A6ECC" wp14:editId="5E897787">
             <wp:extent cx="4953000" cy="1076325"/>
             <wp:effectExtent l="0" t="0" r="0" b="0"/>
-            <wp:docPr id="1386677359" name="Imagen 1386677359"/>
+            <wp:docPr id="952659791" name="Imagen 952659791"/>
             <wp:cNvGraphicFramePr>
               <a:graphicFrameLocks xmlns:a="http://schemas.openxmlformats.org/drawingml/2006/main" noChangeAspect="1"/>
             </wp:cNvGraphicFramePr>
@@ -12926,10 +12995,10 @@
           <w:noProof/>
         </w:rPr>
         <w:drawing>
-          <wp:inline distT="0" distB="0" distL="0" distR="0" wp14:anchorId="33EB786B" wp14:editId="6B776CEC">
+          <wp:inline distT="0" distB="0" distL="0" distR="0" wp14:anchorId="5ABB53B4" wp14:editId="5F86FC2D">
             <wp:extent cx="4953000" cy="1295400"/>
             <wp:effectExtent l="0" t="0" r="0" b="0"/>
-            <wp:docPr id="579800527" name="Imagen 579800527"/>
+            <wp:docPr id="744331526" name="Imagen 744331526"/>
             <wp:cNvGraphicFramePr>
               <a:graphicFrameLocks xmlns:a="http://schemas.openxmlformats.org/drawingml/2006/main" noChangeAspect="1"/>
             </wp:cNvGraphicFramePr>
@@ -12986,7 +13055,7 @@
         <w:pStyle w:val="Ttulo3"/>
         <w:spacing w:before="220" w:after="120"/>
       </w:pPr>
-      <w:bookmarkStart w:id="29" w:name="_Toc238158001"/>
+      <w:bookmarkStart w:id="29" w:name="_Toc238187924"/>
       <w:r>
         <w:rPr>
           <w:b/>
@@ -13505,7 +13574,7 @@
         <w:pStyle w:val="Ttulo2"/>
         <w:spacing w:before="280" w:after="140"/>
       </w:pPr>
-      <w:bookmarkStart w:id="30" w:name="_Toc238158002"/>
+      <w:bookmarkStart w:id="30" w:name="_Toc238187925"/>
       <w:r>
         <w:rPr>
           <w:b/>
@@ -13522,7 +13591,7 @@
         <w:pStyle w:val="Ttulo3"/>
         <w:spacing w:before="220" w:after="120"/>
       </w:pPr>
-      <w:bookmarkStart w:id="31" w:name="_Toc238158003"/>
+      <w:bookmarkStart w:id="31" w:name="_Toc238187926"/>
       <w:r>
         <w:rPr>
           <w:b/>
@@ -14199,7 +14268,7 @@
         <w:pStyle w:val="Ttulo3"/>
         <w:spacing w:before="220" w:after="120"/>
       </w:pPr>
-      <w:bookmarkStart w:id="32" w:name="_Toc238158004"/>
+      <w:bookmarkStart w:id="32" w:name="_Toc238187927"/>
       <w:r>
         <w:rPr>
           <w:b/>
@@ -14222,10 +14291,10 @@
           <w:noProof/>
         </w:rPr>
         <w:drawing>
-          <wp:inline distT="0" distB="0" distL="0" distR="0" wp14:anchorId="5F9A8195" wp14:editId="456A280A">
+          <wp:inline distT="0" distB="0" distL="0" distR="0" wp14:anchorId="588537BE" wp14:editId="09B8555C">
             <wp:extent cx="5524500" cy="3648075"/>
             <wp:effectExtent l="0" t="0" r="0" b="0"/>
-            <wp:docPr id="899163336" name="Imagen 899163336"/>
+            <wp:docPr id="653605539" name="Imagen 653605539"/>
             <wp:cNvGraphicFramePr>
               <a:graphicFrameLocks xmlns:a="http://schemas.openxmlformats.org/drawingml/2006/main" noChangeAspect="1"/>
             </wp:cNvGraphicFramePr>
@@ -14282,7 +14351,7 @@
         <w:pStyle w:val="Ttulo3"/>
         <w:spacing w:before="220" w:after="120"/>
       </w:pPr>
-      <w:bookmarkStart w:id="33" w:name="_Toc238158005"/>
+      <w:bookmarkStart w:id="33" w:name="_Toc238187928"/>
       <w:r>
         <w:rPr>
           <w:b/>
@@ -14306,10 +14375,10 @@
         </w:rPr>
         <w:lastRenderedPageBreak/>
         <w:drawing>
-          <wp:inline distT="0" distB="0" distL="0" distR="0" wp14:anchorId="148EEB97" wp14:editId="49F0BF2B">
+          <wp:inline distT="0" distB="0" distL="0" distR="0" wp14:anchorId="7FAF5C05" wp14:editId="056A3577">
             <wp:extent cx="4953000" cy="2419350"/>
             <wp:effectExtent l="0" t="0" r="0" b="0"/>
-            <wp:docPr id="1949298261" name="Imagen 1949298261"/>
+            <wp:docPr id="1830461561" name="Imagen 1830461561"/>
             <wp:cNvGraphicFramePr>
               <a:graphicFrameLocks xmlns:a="http://schemas.openxmlformats.org/drawingml/2006/main" noChangeAspect="1"/>
             </wp:cNvGraphicFramePr>
@@ -14366,7 +14435,7 @@
         <w:pStyle w:val="Ttulo3"/>
         <w:spacing w:before="220" w:after="120"/>
       </w:pPr>
-      <w:bookmarkStart w:id="34" w:name="_Toc238158006"/>
+      <w:bookmarkStart w:id="34" w:name="_Toc238187929"/>
       <w:r>
         <w:rPr>
           <w:b/>
@@ -15400,7 +15469,7 @@
         <w:pStyle w:val="Ttulo3"/>
         <w:spacing w:before="220" w:after="120"/>
       </w:pPr>
-      <w:bookmarkStart w:id="35" w:name="_Toc238158007"/>
+      <w:bookmarkStart w:id="35" w:name="_Toc238187930"/>
       <w:r>
         <w:rPr>
           <w:b/>
@@ -16114,7 +16183,7 @@
         <w:pStyle w:val="Ttulo2"/>
         <w:spacing w:before="280" w:after="140"/>
       </w:pPr>
-      <w:bookmarkStart w:id="36" w:name="_Toc238158008"/>
+      <w:bookmarkStart w:id="36" w:name="_Toc238187931"/>
       <w:r>
         <w:rPr>
           <w:b/>
@@ -16131,7 +16200,7 @@
         <w:pStyle w:val="Ttulo3"/>
         <w:spacing w:before="220" w:after="120"/>
       </w:pPr>
-      <w:bookmarkStart w:id="37" w:name="_Toc238158009"/>
+      <w:bookmarkStart w:id="37" w:name="_Toc238187932"/>
       <w:r>
         <w:rPr>
           <w:b/>
@@ -16544,7 +16613,7 @@
         <w:pStyle w:val="Ttulo3"/>
         <w:spacing w:before="220" w:after="120"/>
       </w:pPr>
-      <w:bookmarkStart w:id="38" w:name="_Toc238158010"/>
+      <w:bookmarkStart w:id="38" w:name="_Toc238187933"/>
       <w:r>
         <w:rPr>
           <w:b/>
@@ -16567,10 +16636,10 @@
           <w:noProof/>
         </w:rPr>
         <w:drawing>
-          <wp:inline distT="0" distB="0" distL="0" distR="0" wp14:anchorId="33E2C11E" wp14:editId="1D177657">
+          <wp:inline distT="0" distB="0" distL="0" distR="0" wp14:anchorId="5691BD44" wp14:editId="3016CBE5">
             <wp:extent cx="4953000" cy="1009650"/>
             <wp:effectExtent l="0" t="0" r="0" b="0"/>
-            <wp:docPr id="308152752" name="Imagen 308152752"/>
+            <wp:docPr id="1411461499" name="Imagen 1411461499"/>
             <wp:cNvGraphicFramePr>
               <a:graphicFrameLocks xmlns:a="http://schemas.openxmlformats.org/drawingml/2006/main" noChangeAspect="1"/>
             </wp:cNvGraphicFramePr>
@@ -16632,10 +16701,10 @@
           <w:noProof/>
         </w:rPr>
         <w:drawing>
-          <wp:inline distT="0" distB="0" distL="0" distR="0" wp14:anchorId="2823A44D" wp14:editId="7A62D664">
+          <wp:inline distT="0" distB="0" distL="0" distR="0" wp14:anchorId="7598E322" wp14:editId="054E927B">
             <wp:extent cx="4953000" cy="1343025"/>
             <wp:effectExtent l="0" t="0" r="0" b="0"/>
-            <wp:docPr id="395973626" name="Imagen 395973626"/>
+            <wp:docPr id="1446272967" name="Imagen 1446272967"/>
             <wp:cNvGraphicFramePr>
               <a:graphicFrameLocks xmlns:a="http://schemas.openxmlformats.org/drawingml/2006/main" noChangeAspect="1"/>
             </wp:cNvGraphicFramePr>
@@ -16697,10 +16766,10 @@
           <w:noProof/>
         </w:rPr>
         <w:drawing>
-          <wp:inline distT="0" distB="0" distL="0" distR="0" wp14:anchorId="3CC7B1EA" wp14:editId="540133F3">
+          <wp:inline distT="0" distB="0" distL="0" distR="0" wp14:anchorId="3256275D" wp14:editId="2E30FAD8">
             <wp:extent cx="4953000" cy="1343025"/>
             <wp:effectExtent l="0" t="0" r="0" b="0"/>
-            <wp:docPr id="670652494" name="Imagen 670652494"/>
+            <wp:docPr id="1274878334" name="Imagen 1274878334"/>
             <wp:cNvGraphicFramePr>
               <a:graphicFrameLocks xmlns:a="http://schemas.openxmlformats.org/drawingml/2006/main" noChangeAspect="1"/>
             </wp:cNvGraphicFramePr>
@@ -16763,10 +16832,10 @@
         </w:rPr>
         <w:lastRenderedPageBreak/>
         <w:drawing>
-          <wp:inline distT="0" distB="0" distL="0" distR="0" wp14:anchorId="4D32D83A" wp14:editId="329E18F0">
+          <wp:inline distT="0" distB="0" distL="0" distR="0" wp14:anchorId="28140511" wp14:editId="2313136D">
             <wp:extent cx="4953000" cy="1524000"/>
             <wp:effectExtent l="0" t="0" r="0" b="0"/>
-            <wp:docPr id="48874726" name="Imagen 48874726"/>
+            <wp:docPr id="517546644" name="Imagen 517546644"/>
             <wp:cNvGraphicFramePr>
               <a:graphicFrameLocks xmlns:a="http://schemas.openxmlformats.org/drawingml/2006/main" noChangeAspect="1"/>
             </wp:cNvGraphicFramePr>
@@ -16823,7 +16892,7 @@
         <w:pStyle w:val="Ttulo3"/>
         <w:spacing w:before="220" w:after="120"/>
       </w:pPr>
-      <w:bookmarkStart w:id="39" w:name="_Toc238158011"/>
+      <w:bookmarkStart w:id="39" w:name="_Toc238187934"/>
       <w:r>
         <w:rPr>
           <w:b/>
@@ -17254,7 +17323,7 @@
         <w:pStyle w:val="Ttulo1"/>
         <w:spacing w:before="360" w:after="180"/>
       </w:pPr>
-      <w:bookmarkStart w:id="40" w:name="_Toc238158012"/>
+      <w:bookmarkStart w:id="40" w:name="_Toc238187935"/>
       <w:r>
         <w:rPr>
           <w:b/>
@@ -17271,7 +17340,7 @@
         <w:pStyle w:val="Ttulo2"/>
         <w:spacing w:before="280" w:after="140"/>
       </w:pPr>
-      <w:bookmarkStart w:id="41" w:name="_Toc238158013"/>
+      <w:bookmarkStart w:id="41" w:name="_Toc238187936"/>
       <w:r>
         <w:rPr>
           <w:b/>
@@ -17861,7 +17930,7 @@
         <w:pStyle w:val="Ttulo2"/>
         <w:spacing w:before="280" w:after="140"/>
       </w:pPr>
-      <w:bookmarkStart w:id="42" w:name="_Toc238158014"/>
+      <w:bookmarkStart w:id="42" w:name="_Toc238187937"/>
       <w:r>
         <w:rPr>
           <w:b/>
@@ -17891,10 +17960,10 @@
         </w:rPr>
         <w:lastRenderedPageBreak/>
         <w:drawing>
-          <wp:inline distT="0" distB="0" distL="0" distR="0" wp14:anchorId="762F904B" wp14:editId="19BF76AC">
+          <wp:inline distT="0" distB="0" distL="0" distR="0" wp14:anchorId="2DDD038E" wp14:editId="12DE38F4">
             <wp:extent cx="5905500" cy="3829050"/>
             <wp:effectExtent l="0" t="0" r="0" b="0"/>
-            <wp:docPr id="2102243152" name="Imagen 2102243152"/>
+            <wp:docPr id="1994133621" name="Imagen 1994133621"/>
             <wp:cNvGraphicFramePr>
               <a:graphicFrameLocks xmlns:a="http://schemas.openxmlformats.org/drawingml/2006/main" noChangeAspect="1"/>
             </wp:cNvGraphicFramePr>
@@ -17959,7 +18028,7 @@
         <w:pStyle w:val="Ttulo3"/>
         <w:spacing w:before="220" w:after="120"/>
       </w:pPr>
-      <w:bookmarkStart w:id="43" w:name="_Toc238158015"/>
+      <w:bookmarkStart w:id="43" w:name="_Toc238187938"/>
       <w:r>
         <w:rPr>
           <w:b/>
@@ -17968,9 +18037,393 @@
           <w:sz w:val="23"/>
           <w:szCs w:val="23"/>
         </w:rPr>
+        <w:t>Diagrama de clases</w:t>
+      </w:r>
+      <w:bookmarkEnd w:id="43"/>
+    </w:p>
+    <w:p>
+      <w:pPr>
+        <w:spacing w:after="120"/>
+      </w:pPr>
+      <w:r>
+        <w:t>La aplicación de backend se organiza en cuatro capas. Cada una tiene una responsabilidad única y depende solamente de la capa inmediatamente inferior, lo que mantiene la lógica de negocio aislada tanto de la API como del acceso a datos.</w:t>
+      </w:r>
+    </w:p>
+    <w:p>
+      <w:pPr>
+        <w:spacing w:before="160" w:after="80"/>
+        <w:jc w:val="center"/>
+      </w:pPr>
+      <w:r>
+        <w:rPr>
+          <w:noProof/>
+        </w:rPr>
+        <w:lastRenderedPageBreak/>
+        <w:drawing>
+          <wp:inline distT="0" distB="0" distL="0" distR="0" wp14:anchorId="723B9E5D" wp14:editId="743738B0">
+            <wp:extent cx="6096000" cy="4219575"/>
+            <wp:effectExtent l="0" t="0" r="0" b="0"/>
+            <wp:docPr id="216416240" name="Imagen 216416240"/>
+            <wp:cNvGraphicFramePr>
+              <a:graphicFrameLocks xmlns:a="http://schemas.openxmlformats.org/drawingml/2006/main" noChangeAspect="1"/>
+            </wp:cNvGraphicFramePr>
+            <a:graphic xmlns:a="http://schemas.openxmlformats.org/drawingml/2006/main">
+              <a:graphicData uri="http://schemas.openxmlformats.org/drawingml/2006/picture">
+                <pic:pic xmlns:pic="http://schemas.openxmlformats.org/drawingml/2006/picture">
+                  <pic:nvPicPr>
+                    <pic:cNvPr id="0" name=""/>
+                    <pic:cNvPicPr>
+                      <a:picLocks noChangeAspect="1" noChangeArrowheads="1"/>
+                    </pic:cNvPicPr>
+                  </pic:nvPicPr>
+                  <pic:blipFill>
+                    <a:blip r:embed="rId22"/>
+                    <a:srcRect/>
+                    <a:stretch>
+                      <a:fillRect/>
+                    </a:stretch>
+                  </pic:blipFill>
+                  <pic:spPr bwMode="auto">
+                    <a:xfrm>
+                      <a:off x="0" y="0"/>
+                      <a:ext cx="6096000" cy="4219575"/>
+                    </a:xfrm>
+                    <a:prstGeom prst="rect">
+                      <a:avLst/>
+                    </a:prstGeom>
+                  </pic:spPr>
+                </pic:pic>
+              </a:graphicData>
+            </a:graphic>
+          </wp:inline>
+        </w:drawing>
+      </w:r>
+    </w:p>
+    <w:p>
+      <w:pPr>
+        <w:spacing w:after="240"/>
+        <w:jc w:val="center"/>
+      </w:pPr>
+      <w:r>
+        <w:rPr>
+          <w:i/>
+          <w:iCs/>
+          <w:color w:val="7F7F7F"/>
+          <w:sz w:val="18"/>
+          <w:szCs w:val="18"/>
+        </w:rPr>
+        <w:t>Figura 16. Diagrama de clases del backend, organizado por capas.</w:t>
+      </w:r>
+    </w:p>
+    <w:tbl>
+      <w:tblPr>
+        <w:tblW w:w="9360" w:type="dxa"/>
+        <w:tblBorders>
+          <w:top w:val="single" w:sz="4" w:space="0" w:color="B4C6E7"/>
+          <w:left w:val="single" w:sz="4" w:space="0" w:color="B4C6E7"/>
+          <w:bottom w:val="single" w:sz="4" w:space="0" w:color="B4C6E7"/>
+          <w:right w:val="single" w:sz="4" w:space="0" w:color="B4C6E7"/>
+          <w:insideH w:val="single" w:sz="2" w:space="0" w:color="B4C6E7"/>
+          <w:insideV w:val="single" w:sz="2" w:space="0" w:color="B4C6E7"/>
+        </w:tblBorders>
+        <w:tblCellMar>
+          <w:left w:w="10" w:type="dxa"/>
+          <w:right w:w="10" w:type="dxa"/>
+        </w:tblCellMar>
+        <w:tblLook w:val="04A0" w:firstRow="1" w:lastRow="0" w:firstColumn="1" w:lastColumn="0" w:noHBand="0" w:noVBand="1"/>
+      </w:tblPr>
+      <w:tblGrid>
+        <w:gridCol w:w="2000"/>
+        <w:gridCol w:w="7360"/>
+      </w:tblGrid>
+      <w:tr>
+        <w:tblPrEx>
+          <w:tblCellMar>
+            <w:top w:w="0" w:type="dxa"/>
+            <w:bottom w:w="0" w:type="dxa"/>
+          </w:tblCellMar>
+        </w:tblPrEx>
+        <w:trPr>
+          <w:tblHeader/>
+        </w:trPr>
+        <w:tc>
+          <w:tcPr>
+            <w:tcW w:w="2000" w:type="dxa"/>
+            <w:shd w:val="clear" w:color="auto" w:fill="D9E2F3"/>
+            <w:tcMar>
+              <w:top w:w="60" w:type="dxa"/>
+              <w:left w:w="100" w:type="dxa"/>
+              <w:bottom w:w="60" w:type="dxa"/>
+              <w:right w:w="100" w:type="dxa"/>
+            </w:tcMar>
+          </w:tcPr>
+          <w:p>
+            <w:r>
+              <w:rPr>
+                <w:b/>
+                <w:bCs/>
+                <w:color w:val="1F3864"/>
+                <w:sz w:val="19"/>
+                <w:szCs w:val="19"/>
+              </w:rPr>
+              <w:t>Capa</w:t>
+            </w:r>
+          </w:p>
+        </w:tc>
+        <w:tc>
+          <w:tcPr>
+            <w:tcW w:w="7360" w:type="dxa"/>
+            <w:shd w:val="clear" w:color="auto" w:fill="D9E2F3"/>
+            <w:tcMar>
+              <w:top w:w="60" w:type="dxa"/>
+              <w:left w:w="100" w:type="dxa"/>
+              <w:bottom w:w="60" w:type="dxa"/>
+              <w:right w:w="100" w:type="dxa"/>
+            </w:tcMar>
+          </w:tcPr>
+          <w:p>
+            <w:r>
+              <w:rPr>
+                <w:b/>
+                <w:bCs/>
+                <w:color w:val="1F3864"/>
+                <w:sz w:val="19"/>
+                <w:szCs w:val="19"/>
+              </w:rPr>
+              <w:t>Responsabilidad</w:t>
+            </w:r>
+          </w:p>
+        </w:tc>
+      </w:tr>
+      <w:tr>
+        <w:tblPrEx>
+          <w:tblCellMar>
+            <w:top w:w="0" w:type="dxa"/>
+            <w:bottom w:w="0" w:type="dxa"/>
+          </w:tblCellMar>
+        </w:tblPrEx>
+        <w:tc>
+          <w:tcPr>
+            <w:tcW w:w="2000" w:type="dxa"/>
+            <w:tcMar>
+              <w:top w:w="60" w:type="dxa"/>
+              <w:left w:w="100" w:type="dxa"/>
+              <w:bottom w:w="60" w:type="dxa"/>
+              <w:right w:w="100" w:type="dxa"/>
+            </w:tcMar>
+          </w:tcPr>
+          <w:p>
+            <w:r>
+              <w:rPr>
+                <w:sz w:val="19"/>
+                <w:szCs w:val="19"/>
+              </w:rPr>
+              <w:t>Control</w:t>
+            </w:r>
+          </w:p>
+        </w:tc>
+        <w:tc>
+          <w:tcPr>
+            <w:tcW w:w="7360" w:type="dxa"/>
+            <w:tcMar>
+              <w:top w:w="60" w:type="dxa"/>
+              <w:left w:w="100" w:type="dxa"/>
+              <w:bottom w:w="60" w:type="dxa"/>
+              <w:right w:w="100" w:type="dxa"/>
+            </w:tcMar>
+          </w:tcPr>
+          <w:p>
+            <w:r>
+              <w:rPr>
+                <w:sz w:val="19"/>
+                <w:szCs w:val="19"/>
+              </w:rPr>
+              <w:t>Expone la API REST. No contiene lógica de negocio: delega en la capa de servicio.</w:t>
+            </w:r>
+          </w:p>
+        </w:tc>
+      </w:tr>
+      <w:tr>
+        <w:tblPrEx>
+          <w:tblCellMar>
+            <w:top w:w="0" w:type="dxa"/>
+            <w:bottom w:w="0" w:type="dxa"/>
+          </w:tblCellMar>
+        </w:tblPrEx>
+        <w:tc>
+          <w:tcPr>
+            <w:tcW w:w="2000" w:type="dxa"/>
+            <w:tcMar>
+              <w:top w:w="60" w:type="dxa"/>
+              <w:left w:w="100" w:type="dxa"/>
+              <w:bottom w:w="60" w:type="dxa"/>
+              <w:right w:w="100" w:type="dxa"/>
+            </w:tcMar>
+          </w:tcPr>
+          <w:p>
+            <w:r>
+              <w:rPr>
+                <w:sz w:val="19"/>
+                <w:szCs w:val="19"/>
+              </w:rPr>
+              <w:t>Servicio</w:t>
+            </w:r>
+          </w:p>
+        </w:tc>
+        <w:tc>
+          <w:tcPr>
+            <w:tcW w:w="7360" w:type="dxa"/>
+            <w:tcMar>
+              <w:top w:w="60" w:type="dxa"/>
+              <w:left w:w="100" w:type="dxa"/>
+              <w:bottom w:w="60" w:type="dxa"/>
+              <w:right w:w="100" w:type="dxa"/>
+            </w:tcMar>
+          </w:tcPr>
+          <w:p>
+            <w:r>
+              <w:rPr>
+                <w:sz w:val="19"/>
+                <w:szCs w:val="19"/>
+              </w:rPr>
+              <w:t>Concentra las validaciones y las reglas de negocio, y define los límites transaccionales.</w:t>
+            </w:r>
+          </w:p>
+        </w:tc>
+      </w:tr>
+      <w:tr>
+        <w:tblPrEx>
+          <w:tblCellMar>
+            <w:top w:w="0" w:type="dxa"/>
+            <w:bottom w:w="0" w:type="dxa"/>
+          </w:tblCellMar>
+        </w:tblPrEx>
+        <w:tc>
+          <w:tcPr>
+            <w:tcW w:w="2000" w:type="dxa"/>
+            <w:tcMar>
+              <w:top w:w="60" w:type="dxa"/>
+              <w:left w:w="100" w:type="dxa"/>
+              <w:bottom w:w="60" w:type="dxa"/>
+              <w:right w:w="100" w:type="dxa"/>
+            </w:tcMar>
+          </w:tcPr>
+          <w:p>
+            <w:r>
+              <w:rPr>
+                <w:sz w:val="19"/>
+                <w:szCs w:val="19"/>
+              </w:rPr>
+              <w:t>Persistencia</w:t>
+            </w:r>
+          </w:p>
+        </w:tc>
+        <w:tc>
+          <w:tcPr>
+            <w:tcW w:w="7360" w:type="dxa"/>
+            <w:tcMar>
+              <w:top w:w="60" w:type="dxa"/>
+              <w:left w:w="100" w:type="dxa"/>
+              <w:bottom w:w="60" w:type="dxa"/>
+              <w:right w:w="100" w:type="dxa"/>
+            </w:tcMar>
+          </w:tcPr>
+          <w:p>
+            <w:r>
+              <w:rPr>
+                <w:sz w:val="19"/>
+                <w:szCs w:val="19"/>
+              </w:rPr>
+              <w:t>Interfaces de Spring Data JPA; el framework genera la implementación a partir del nombre del método.</w:t>
+            </w:r>
+          </w:p>
+        </w:tc>
+      </w:tr>
+      <w:tr>
+        <w:tblPrEx>
+          <w:tblCellMar>
+            <w:top w:w="0" w:type="dxa"/>
+            <w:bottom w:w="0" w:type="dxa"/>
+          </w:tblCellMar>
+        </w:tblPrEx>
+        <w:tc>
+          <w:tcPr>
+            <w:tcW w:w="2000" w:type="dxa"/>
+            <w:tcMar>
+              <w:top w:w="60" w:type="dxa"/>
+              <w:left w:w="100" w:type="dxa"/>
+              <w:bottom w:w="60" w:type="dxa"/>
+              <w:right w:w="100" w:type="dxa"/>
+            </w:tcMar>
+          </w:tcPr>
+          <w:p>
+            <w:r>
+              <w:rPr>
+                <w:sz w:val="19"/>
+                <w:szCs w:val="19"/>
+              </w:rPr>
+              <w:t>Modelo</w:t>
+            </w:r>
+          </w:p>
+        </w:tc>
+        <w:tc>
+          <w:tcPr>
+            <w:tcW w:w="7360" w:type="dxa"/>
+            <w:tcMar>
+              <w:top w:w="60" w:type="dxa"/>
+              <w:left w:w="100" w:type="dxa"/>
+              <w:bottom w:w="60" w:type="dxa"/>
+              <w:right w:w="100" w:type="dxa"/>
+            </w:tcMar>
+          </w:tcPr>
+          <w:p>
+            <w:r>
+              <w:rPr>
+                <w:sz w:val="19"/>
+                <w:szCs w:val="19"/>
+              </w:rPr>
+              <w:t>Entidades JPA, una por cada tabla de la base de datos.</w:t>
+            </w:r>
+          </w:p>
+        </w:tc>
+      </w:tr>
+    </w:tbl>
+    <w:p>
+      <w:pPr>
+        <w:spacing w:after="160"/>
+      </w:pPr>
+    </w:p>
+    <w:p>
+      <w:pPr>
+        <w:spacing w:after="120"/>
+      </w:pPr>
+      <w:r>
+        <w:t>Los módulos de clientes, proveedores y detalle de ventas siguen exactamente la misma estructura, por lo que se omiten del diagrama para mantenerlo legible.</w:t>
+      </w:r>
+    </w:p>
+    <w:p>
+      <w:r>
+        <w:br w:type="page"/>
+      </w:r>
+    </w:p>
+    <w:p>
+      <w:pPr>
+        <w:pStyle w:val="Ttulo3"/>
+        <w:spacing w:before="220" w:after="120"/>
+      </w:pPr>
+      <w:bookmarkStart w:id="44" w:name="_Toc238187939"/>
+      <w:r>
+        <w:rPr>
+          <w:b/>
+          <w:bCs/>
+          <w:color w:val="2E5496"/>
+          <w:sz w:val="23"/>
+          <w:szCs w:val="23"/>
+        </w:rPr>
+        <w:lastRenderedPageBreak/>
         <w:t>Estructura de las tablas</w:t>
       </w:r>
-      <w:bookmarkEnd w:id="43"/>
+      <w:bookmarkEnd w:id="44"/>
     </w:p>
     <w:tbl>
       <w:tblPr>
@@ -18496,7 +18949,7 @@
         <w:pStyle w:val="Ttulo2"/>
         <w:spacing w:before="280" w:after="140"/>
       </w:pPr>
-      <w:bookmarkStart w:id="44" w:name="_Toc238158016"/>
+      <w:bookmarkStart w:id="45" w:name="_Toc238187940"/>
       <w:r>
         <w:rPr>
           <w:b/>
@@ -18506,7 +18959,7 @@
         <w:lastRenderedPageBreak/>
         <w:t>Especificación de la API para la conexión del frontend con el backend</w:t>
       </w:r>
-      <w:bookmarkEnd w:id="44"/>
+      <w:bookmarkEnd w:id="45"/>
     </w:p>
     <w:p>
       <w:pPr>
@@ -18521,7 +18974,7 @@
         <w:pStyle w:val="Ttulo3"/>
         <w:spacing w:before="220" w:after="120"/>
       </w:pPr>
-      <w:bookmarkStart w:id="45" w:name="_Toc238158017"/>
+      <w:bookmarkStart w:id="46" w:name="_Toc238187941"/>
       <w:r>
         <w:rPr>
           <w:b/>
@@ -18532,7 +18985,7 @@
         </w:rPr>
         <w:t>Convención de operaciones</w:t>
       </w:r>
-      <w:bookmarkEnd w:id="45"/>
+      <w:bookmarkEnd w:id="46"/>
     </w:p>
     <w:p>
       <w:pPr>
@@ -19006,7 +19459,7 @@
         <w:pStyle w:val="Ttulo3"/>
         <w:spacing w:before="220" w:after="120"/>
       </w:pPr>
-      <w:bookmarkStart w:id="46" w:name="_Toc238158018"/>
+      <w:bookmarkStart w:id="47" w:name="_Toc238187942"/>
       <w:r>
         <w:rPr>
           <w:b/>
@@ -19017,7 +19470,7 @@
         </w:rPr>
         <w:t>Operaciones específicas de cada módulo</w:t>
       </w:r>
-      <w:bookmarkEnd w:id="46"/>
+      <w:bookmarkEnd w:id="47"/>
     </w:p>
     <w:tbl>
       <w:tblPr>
@@ -19679,7 +20132,7 @@
         <w:pStyle w:val="Ttulo3"/>
         <w:spacing w:before="220" w:after="120"/>
       </w:pPr>
-      <w:bookmarkStart w:id="47" w:name="_Toc238158019"/>
+      <w:bookmarkStart w:id="48" w:name="_Toc238187943"/>
       <w:r>
         <w:rPr>
           <w:b/>
@@ -19690,7 +20143,7 @@
         </w:rPr>
         <w:t>Códigos de estado</w:t>
       </w:r>
-      <w:bookmarkEnd w:id="47"/>
+      <w:bookmarkEnd w:id="48"/>
     </w:p>
     <w:tbl>
       <w:tblPr>
@@ -20080,7 +20533,7 @@
         <w:pStyle w:val="Ttulo3"/>
         <w:spacing w:before="220" w:after="120"/>
       </w:pPr>
-      <w:bookmarkStart w:id="48" w:name="_Toc238158020"/>
+      <w:bookmarkStart w:id="49" w:name="_Toc238187944"/>
       <w:r>
         <w:rPr>
           <w:b/>
@@ -20091,7 +20544,7 @@
         </w:rPr>
         <w:t>Documentación interactiva</w:t>
       </w:r>
-      <w:bookmarkEnd w:id="48"/>
+      <w:bookmarkEnd w:id="49"/>
     </w:p>
     <w:p>
       <w:pPr>
@@ -20111,10 +20564,10 @@
           <w:noProof/>
         </w:rPr>
         <w:drawing>
-          <wp:inline distT="0" distB="0" distL="0" distR="0" wp14:anchorId="61386DD6" wp14:editId="4CDAA447">
+          <wp:inline distT="0" distB="0" distL="0" distR="0" wp14:anchorId="0586AF27" wp14:editId="1AFA1E59">
             <wp:extent cx="4953000" cy="3095625"/>
             <wp:effectExtent l="0" t="0" r="0" b="0"/>
-            <wp:docPr id="1257040981" name="Imagen 1257040981"/>
+            <wp:docPr id="208222856" name="Imagen 208222856"/>
             <wp:cNvGraphicFramePr>
               <a:graphicFrameLocks xmlns:a="http://schemas.openxmlformats.org/drawingml/2006/main" noChangeAspect="1"/>
             </wp:cNvGraphicFramePr>
@@ -20128,7 +20581,7 @@
                     </pic:cNvPicPr>
                   </pic:nvPicPr>
                   <pic:blipFill>
-                    <a:blip r:embed="rId22"/>
+                    <a:blip r:embed="rId23"/>
                     <a:srcRect/>
                     <a:stretch>
                       <a:fillRect/>
@@ -20163,7 +20616,7 @@
           <w:sz w:val="18"/>
           <w:szCs w:val="18"/>
         </w:rPr>
-        <w:t>Figura 16. Documentación interactiva de la API generada con Swagger UI.</w:t>
+        <w:t>Figura 17. Documentación interactiva de la API generada con Swagger UI.</w:t>
       </w:r>
     </w:p>
     <w:p>
@@ -20176,7 +20629,7 @@
         <w:pStyle w:val="Ttulo2"/>
         <w:spacing w:before="280" w:after="140"/>
       </w:pPr>
-      <w:bookmarkStart w:id="49" w:name="_Toc238158021"/>
+      <w:bookmarkStart w:id="50" w:name="_Toc238187945"/>
       <w:r>
         <w:rPr>
           <w:b/>
@@ -20186,7 +20639,7 @@
         <w:lastRenderedPageBreak/>
         <w:t>Publicación del proyecto en la plataforma AWS</w:t>
       </w:r>
-      <w:bookmarkEnd w:id="49"/>
+      <w:bookmarkEnd w:id="50"/>
     </w:p>
     <w:p>
       <w:pPr>
@@ -20652,7 +21105,7 @@
         <w:pStyle w:val="Ttulo3"/>
         <w:spacing w:before="220" w:after="120"/>
       </w:pPr>
-      <w:bookmarkStart w:id="50" w:name="_Toc238158022"/>
+      <w:bookmarkStart w:id="51" w:name="_Toc238187946"/>
       <w:r>
         <w:rPr>
           <w:b/>
@@ -20663,7 +21116,7 @@
         </w:rPr>
         <w:t>Configuración del backend contra la instancia RDS</w:t>
       </w:r>
-      <w:bookmarkEnd w:id="50"/>
+      <w:bookmarkEnd w:id="51"/>
     </w:p>
     <w:p>
       <w:pPr>
@@ -21060,7 +21513,7 @@
         <w:pStyle w:val="Ttulo3"/>
         <w:spacing w:before="220" w:after="120"/>
       </w:pPr>
-      <w:bookmarkStart w:id="51" w:name="_Toc238158023"/>
+      <w:bookmarkStart w:id="52" w:name="_Toc238187947"/>
       <w:r>
         <w:rPr>
           <w:b/>
@@ -21071,7 +21524,7 @@
         </w:rPr>
         <w:t>Configuración del frontend contra el backend</w:t>
       </w:r>
-      <w:bookmarkEnd w:id="51"/>
+      <w:bookmarkEnd w:id="52"/>
     </w:p>
     <w:p>
       <w:pPr>
@@ -21086,7 +21539,7 @@
         <w:pStyle w:val="Ttulo3"/>
         <w:spacing w:before="220" w:after="120"/>
       </w:pPr>
-      <w:bookmarkStart w:id="52" w:name="_Toc238158024"/>
+      <w:bookmarkStart w:id="53" w:name="_Toc238187948"/>
       <w:r>
         <w:rPr>
           <w:b/>
@@ -21097,7 +21550,7 @@
         </w:rPr>
         <w:t>Verificación del despliegue</w:t>
       </w:r>
-      <w:bookmarkEnd w:id="52"/>
+      <w:bookmarkEnd w:id="53"/>
     </w:p>
     <w:tbl>
       <w:tblPr>
@@ -21383,7 +21836,7 @@
         <w:pStyle w:val="Ttulo2"/>
         <w:spacing w:before="280" w:after="140"/>
       </w:pPr>
-      <w:bookmarkStart w:id="53" w:name="_Toc238158025"/>
+      <w:bookmarkStart w:id="54" w:name="_Toc238187949"/>
       <w:r>
         <w:rPr>
           <w:b/>
@@ -21392,7 +21845,7 @@
         </w:rPr>
         <w:t>Repositorio y ambientes de desarrollo y producción</w:t>
       </w:r>
-      <w:bookmarkEnd w:id="53"/>
+      <w:bookmarkEnd w:id="54"/>
     </w:p>
     <w:p>
       <w:pPr>
@@ -21662,7 +22115,7 @@
         <w:pStyle w:val="Ttulo3"/>
         <w:spacing w:before="220" w:after="120"/>
       </w:pPr>
-      <w:bookmarkStart w:id="54" w:name="_Toc238158026"/>
+      <w:bookmarkStart w:id="55" w:name="_Toc238187950"/>
       <w:r>
         <w:rPr>
           <w:b/>
@@ -21673,7 +22126,7 @@
         </w:rPr>
         <w:t>Integración continua</w:t>
       </w:r>
-      <w:bookmarkEnd w:id="54"/>
+      <w:bookmarkEnd w:id="55"/>
     </w:p>
     <w:p>
       <w:pPr>
@@ -21966,7 +22419,7 @@
         <w:pStyle w:val="Ttulo1"/>
         <w:spacing w:before="360" w:after="180"/>
       </w:pPr>
-      <w:bookmarkStart w:id="55" w:name="_Toc238158027"/>
+      <w:bookmarkStart w:id="56" w:name="_Toc238187951"/>
       <w:r>
         <w:rPr>
           <w:b/>
@@ -21976,7 +22429,7 @@
         <w:lastRenderedPageBreak/>
         <w:t>Resultados de las Pruebas</w:t>
       </w:r>
-      <w:bookmarkEnd w:id="55"/>
+      <w:bookmarkEnd w:id="56"/>
     </w:p>
     <w:p>
       <w:pPr>
@@ -21991,7 +22444,7 @@
         <w:pStyle w:val="Ttulo2"/>
         <w:spacing w:before="280" w:after="140"/>
       </w:pPr>
-      <w:bookmarkStart w:id="56" w:name="_Toc238158028"/>
+      <w:bookmarkStart w:id="57" w:name="_Toc238187952"/>
       <w:r>
         <w:rPr>
           <w:b/>
@@ -22000,7 +22453,7 @@
         </w:rPr>
         <w:t>Resumen por sprint</w:t>
       </w:r>
-      <w:bookmarkEnd w:id="56"/>
+      <w:bookmarkEnd w:id="57"/>
     </w:p>
     <w:tbl>
       <w:tblPr>
@@ -22816,7 +23269,7 @@
         <w:pStyle w:val="Ttulo2"/>
         <w:spacing w:before="280" w:after="140"/>
       </w:pPr>
-      <w:bookmarkStart w:id="57" w:name="_Toc238158029"/>
+      <w:bookmarkStart w:id="58" w:name="_Toc238187953"/>
       <w:r>
         <w:rPr>
           <w:b/>
@@ -22825,7 +23278,7 @@
         </w:rPr>
         <w:t>Entornos de ejecución de las pruebas</w:t>
       </w:r>
-      <w:bookmarkEnd w:id="57"/>
+      <w:bookmarkEnd w:id="58"/>
     </w:p>
     <w:p>
       <w:pPr>
@@ -23095,7 +23548,7 @@
         <w:pStyle w:val="Ttulo2"/>
         <w:spacing w:before="280" w:after="140"/>
       </w:pPr>
-      <w:bookmarkStart w:id="58" w:name="_Toc238158030"/>
+      <w:bookmarkStart w:id="59" w:name="_Toc238187954"/>
       <w:r>
         <w:rPr>
           <w:b/>
@@ -23104,7 +23557,7 @@
         </w:rPr>
         <w:t>Pruebas de aceptación</w:t>
       </w:r>
-      <w:bookmarkEnd w:id="58"/>
+      <w:bookmarkEnd w:id="59"/>
     </w:p>
     <w:p>
       <w:pPr>
@@ -23788,7 +24241,7 @@
         <w:pStyle w:val="Ttulo1"/>
         <w:spacing w:before="360" w:after="180"/>
       </w:pPr>
-      <w:bookmarkStart w:id="59" w:name="_Toc238158031"/>
+      <w:bookmarkStart w:id="60" w:name="_Toc238187955"/>
       <w:r>
         <w:rPr>
           <w:b/>
@@ -23798,14 +24251,14 @@
         <w:lastRenderedPageBreak/>
         <w:t>Anexos</w:t>
       </w:r>
-      <w:bookmarkEnd w:id="59"/>
+      <w:bookmarkEnd w:id="60"/>
     </w:p>
     <w:p>
       <w:pPr>
         <w:pStyle w:val="Ttulo2"/>
         <w:spacing w:before="280" w:after="140"/>
       </w:pPr>
-      <w:bookmarkStart w:id="60" w:name="_Toc238158032"/>
+      <w:bookmarkStart w:id="61" w:name="_Toc238187956"/>
       <w:r>
         <w:rPr>
           <w:b/>
@@ -23814,7 +24267,7 @@
         </w:rPr>
         <w:t>Anexo A. Puesta en marcha del sistema</w:t>
       </w:r>
-      <w:bookmarkEnd w:id="60"/>
+      <w:bookmarkEnd w:id="61"/>
     </w:p>
     <w:p>
       <w:pPr>
@@ -24067,7 +24520,7 @@
         <w:pStyle w:val="Ttulo2"/>
         <w:spacing w:before="280" w:after="140"/>
       </w:pPr>
-      <w:bookmarkStart w:id="61" w:name="_Toc238158033"/>
+      <w:bookmarkStart w:id="62" w:name="_Toc238187957"/>
       <w:r>
         <w:rPr>
           <w:b/>
@@ -24076,7 +24529,7 @@
         </w:rPr>
         <w:t>Anexo B. Archivo de muestra de productos</w:t>
       </w:r>
-      <w:bookmarkEnd w:id="61"/>
+      <w:bookmarkEnd w:id="62"/>
     </w:p>
     <w:p>
       <w:pPr>
@@ -26590,7 +27043,7 @@
         <w:pStyle w:val="Ttulo2"/>
         <w:spacing w:before="280" w:after="140"/>
       </w:pPr>
-      <w:bookmarkStart w:id="62" w:name="_Toc238158034"/>
+      <w:bookmarkStart w:id="63" w:name="_Toc238187958"/>
       <w:r>
         <w:rPr>
           <w:b/>
@@ -26599,7 +27052,7 @@
         </w:rPr>
         <w:t>Anexo C. Contenido del repositorio</w:t>
       </w:r>
-      <w:bookmarkEnd w:id="62"/>
+      <w:bookmarkEnd w:id="63"/>
     </w:p>
     <w:tbl>
       <w:tblPr>
@@ -27068,10 +27521,10 @@
     </w:tbl>
     <w:p/>
     <w:sectPr>
-      <w:headerReference w:type="default" r:id="rId23"/>
-      <w:footerReference w:type="default" r:id="rId24"/>
-      <w:headerReference w:type="first" r:id="rId25"/>
-      <w:footerReference w:type="first" r:id="rId26"/>
+      <w:headerReference w:type="default" r:id="rId24"/>
+      <w:footerReference w:type="default" r:id="rId25"/>
+      <w:headerReference w:type="first" r:id="rId26"/>
+      <w:footerReference w:type="first" r:id="rId27"/>
       <w:pgSz w:w="12240" w:h="15840"/>
       <w:pgMar w:top="1440" w:right="1440" w:bottom="1440" w:left="1440" w:header="720" w:footer="720" w:gutter="0"/>
       <w:cols w:space="720"/>
@@ -27264,10 +27717,10 @@
 <file path=word/numbering.xml><?xml version="1.0" encoding="utf-8"?>
 <w:numbering xmlns:wpc="http://schemas.microsoft.com/office/word/2010/wordprocessingCanvas" xmlns:cx="http://schemas.microsoft.com/office/drawing/2014/chartex" xmlns:cx1="http://schemas.microsoft.com/office/drawing/2015/9/8/chartex" xmlns:cx2="http://schemas.microsoft.com/office/drawing/2015/10/21/chartex" xmlns:cx3="http://schemas.microsoft.com/office/drawing/2016/5/9/chartex" xmlns:cx4="http://schemas.microsoft.com/office/drawing/2016/5/10/chartex" xmlns:cx5="http://schemas.microsoft.com/office/drawing/2016/5/11/chartex" xmlns:cx6="http://schemas.microsoft.com/office/drawing/2016/5/12/chartex" xmlns:cx7="http://schemas.microsoft.com/office/drawing/2016/5/13/chartex" xmlns:cx8="http://schemas.microsoft.com/office/drawing/2016/5/14/chartex" xmlns:mc="http://schemas.openxmlformats.org/markup-compatibility/2006" xmlns:aink="http://schemas.microsoft.com/office/drawing/2016/ink" xmlns:am3d="http://schemas.microsoft.com/office/drawing/2017/model3d" xmlns:o="urn:schemas-microsoft-com:office:office" xmlns:oel="http://schemas.microsoft.com/office/2019/extlst" xmlns:r="http://schemas.openxmlformats.org/officeDocument/2006/relationships" xmlns:m="http://schemas.openxmlformats.org/officeDocument/2006/math" xmlns:v="urn:schemas-microsoft-com:vml" xmlns:wp14="http://schemas.microsoft.com/office/word/2010/wordprocessingDrawing" xmlns:wp="http://schemas.openxmlformats.org/drawingml/2006/wordprocessingDrawing" xmlns:w10="urn:schemas-microsoft-com:office:word" xmlns:w="http://schemas.openxmlformats.org/wordprocessingml/2006/main" xmlns:w14="http://schemas.microsoft.com/office/word/2010/wordml" xmlns:w15="http://schemas.microsoft.com/office/word/2012/wordml" xmlns:w16cex="http://schemas.microsoft.com/office/word/2018/wordml/cex" xmlns:w16cid="http://schemas.microsoft.com/office/word/2016/wordml/cid" xmlns:w16="http://schemas.microsoft.com/office/word/2018/wordml" xmlns:w16du="http://schemas.microsoft.com/office/word/2023/wordml/word16du" xmlns:w16sdtdh="http://schemas.microsoft.com/office/word/2020/wordml/sdtdatahash" xmlns:w16sdtfl="http://schemas.microsoft.com/office/word/2024/wordml/sdtformatlock" xmlns:w16se="http://schemas.microsoft.com/office/word/2015/wordml/symex" xmlns:wpg="http://schemas.microsoft.com/office/word/2010/wordprocessingGroup" xmlns:wpi="http://schemas.microsoft.com/office/word/2010/wordprocessingInk" xmlns:wne="http://schemas.microsoft.com/office/word/2006/wordml" xmlns:wps="http://schemas.microsoft.com/office/word/2010/wordprocessingShape" mc:Ignorable="w14 w15 w16se w16cid w16 w16cex w16sdtdh w16sdtfl w16du wp14">
   <w:abstractNum w:abstractNumId="0" w15:restartNumberingAfterBreak="0">
-    <w:nsid w:val="41522932"/>
+    <w:nsid w:val="3E37170C"/>
     <w:multiLevelType w:val="hybridMultilevel"/>
-    <w:tmpl w:val="9152643C"/>
-    <w:lvl w:ilvl="0" w:tplc="DB38A8FE">
+    <w:tmpl w:val="4A46C680"/>
+    <w:lvl w:ilvl="0" w:tplc="BF7A547E">
       <w:start w:val="1"/>
       <w:numFmt w:val="bullet"/>
       <w:lvlText w:val="●"/>
@@ -27276,7 +27729,7 @@
         <w:ind w:left="720" w:hanging="360"/>
       </w:pPr>
     </w:lvl>
-    <w:lvl w:ilvl="1" w:tplc="9B5C941C">
+    <w:lvl w:ilvl="1" w:tplc="C6565B8C">
       <w:start w:val="1"/>
       <w:numFmt w:val="bullet"/>
       <w:lvlText w:val="○"/>
@@ -27285,7 +27738,7 @@
         <w:ind w:left="1440" w:hanging="360"/>
       </w:pPr>
     </w:lvl>
-    <w:lvl w:ilvl="2" w:tplc="59801BCE">
+    <w:lvl w:ilvl="2" w:tplc="747071CA">
       <w:start w:val="1"/>
       <w:numFmt w:val="bullet"/>
       <w:lvlText w:val="■"/>
@@ -27294,7 +27747,7 @@
         <w:ind w:left="2160" w:hanging="360"/>
       </w:pPr>
     </w:lvl>
-    <w:lvl w:ilvl="3" w:tplc="2670DE7C">
+    <w:lvl w:ilvl="3" w:tplc="C7C8CA40">
       <w:start w:val="1"/>
       <w:numFmt w:val="bullet"/>
       <w:lvlText w:val="●"/>
@@ -27303,7 +27756,7 @@
         <w:ind w:left="2880" w:hanging="360"/>
       </w:pPr>
     </w:lvl>
-    <w:lvl w:ilvl="4" w:tplc="E77C11EE">
+    <w:lvl w:ilvl="4" w:tplc="7EFCFA76">
       <w:start w:val="1"/>
       <w:numFmt w:val="bullet"/>
       <w:lvlText w:val="○"/>
@@ -27312,7 +27765,7 @@
         <w:ind w:left="3600" w:hanging="360"/>
       </w:pPr>
     </w:lvl>
-    <w:lvl w:ilvl="5" w:tplc="3F3A03EE">
+    <w:lvl w:ilvl="5" w:tplc="1486CF42">
       <w:start w:val="1"/>
       <w:numFmt w:val="bullet"/>
       <w:lvlText w:val="■"/>
@@ -27321,7 +27774,7 @@
         <w:ind w:left="4320" w:hanging="360"/>
       </w:pPr>
     </w:lvl>
-    <w:lvl w:ilvl="6" w:tplc="3D78B186">
+    <w:lvl w:ilvl="6" w:tplc="A2E6EAD6">
       <w:start w:val="1"/>
       <w:numFmt w:val="bullet"/>
       <w:lvlText w:val="●"/>
@@ -27330,7 +27783,7 @@
         <w:ind w:left="5040" w:hanging="360"/>
       </w:pPr>
     </w:lvl>
-    <w:lvl w:ilvl="7" w:tplc="E0EC64A2">
+    <w:lvl w:ilvl="7" w:tplc="A5C288F2">
       <w:start w:val="1"/>
       <w:numFmt w:val="bullet"/>
       <w:lvlText w:val="●"/>
@@ -27339,7 +27792,7 @@
         <w:ind w:left="5760" w:hanging="360"/>
       </w:pPr>
     </w:lvl>
-    <w:lvl w:ilvl="8" w:tplc="2BA6E776">
+    <w:lvl w:ilvl="8" w:tplc="37CAB39C">
       <w:start w:val="1"/>
       <w:numFmt w:val="bullet"/>
       <w:lvlText w:val="●"/>
@@ -27349,7 +27802,7 @@
       </w:pPr>
     </w:lvl>
   </w:abstractNum>
-  <w:num w:numId="1" w16cid:durableId="2092044713">
+  <w:num w:numId="1" w16cid:durableId="195583173">
     <w:abstractNumId w:val="0"/>
     <w:lvlOverride w:ilvl="0">
       <w:startOverride w:val="1"/>
@@ -27962,7 +28415,7 @@
     <w:autoRedefine/>
     <w:uiPriority w:val="39"/>
     <w:unhideWhenUsed/>
-    <w:rsid w:val="003144C7"/>
+    <w:rsid w:val="009C15EA"/>
     <w:pPr>
       <w:spacing w:after="100"/>
     </w:pPr>
@@ -27974,7 +28427,7 @@
     <w:autoRedefine/>
     <w:uiPriority w:val="39"/>
     <w:unhideWhenUsed/>
-    <w:rsid w:val="003144C7"/>
+    <w:rsid w:val="009C15EA"/>
     <w:pPr>
       <w:spacing w:after="100"/>
       <w:ind w:left="220"/>
@@ -27987,7 +28440,7 @@
     <w:autoRedefine/>
     <w:uiPriority w:val="39"/>
     <w:unhideWhenUsed/>
-    <w:rsid w:val="003144C7"/>
+    <w:rsid w:val="009C15EA"/>
     <w:pPr>
       <w:spacing w:after="100"/>
       <w:ind w:left="440"/>

</xml_diff>